<commit_message>
Run full SWE-bench cost-quality replay and prepare metered Codex study
</commit_message>
<xml_diff>
--- a/docs/paper/paper.docx
+++ b/docs/paper/paper.docx
@@ -254,7 +254,13 @@
         <w:t xml:space="preserve"> </w:t>
       </w:r>
       <w:r>
-        <w:t xml:space="preserve">pilot and a prospective confirmatory protocol. Its central contribution is an</w:t>
+        <w:t xml:space="preserve">pilot, a completed 500-task SWE-bench Verified routing replay, and a prospective</w:t>
+      </w:r>
+      <w:r>
+        <w:t xml:space="preserve"> </w:t>
+      </w:r>
+      <w:r>
+        <w:t xml:space="preserve">confirmatory conversation protocol. Its central contribution is an</w:t>
       </w:r>
       <w:r>
         <w:t xml:space="preserve"> </w:t>
@@ -357,13 +363,19 @@
         <w:t xml:space="preserve"> </w:t>
       </w:r>
       <w:r>
-        <w:t xml:space="preserve">to complete. No institutional approval, model-training result or dollar saving</w:t>
-      </w:r>
-      <w:r>
-        <w:t xml:space="preserve"> </w:t>
-      </w:r>
-      <w:r>
-        <w:t xml:space="preserve">is implied by this manuscript.</w:t>
+        <w:t xml:space="preserve">to complete. No institutional approval or model-training result is implied by</w:t>
+      </w:r>
+      <w:r>
+        <w:t xml:space="preserve"> </w:t>
+      </w:r>
+      <w:r>
+        <w:t xml:space="preserve">this manuscript. Historical estimated inference savings are reported separately</w:t>
+      </w:r>
+      <w:r>
+        <w:t xml:space="preserve"> </w:t>
+      </w:r>
+      <w:r>
+        <w:t xml:space="preserve">from unmeasured conversation benefits, current bills and subscription usage.</w:t>
       </w:r>
     </w:p>
     <w:bookmarkEnd w:id="20"/>
@@ -493,6 +505,62 @@
         <w:pStyle w:val="BodyText"/>
       </w:pPr>
       <w:r>
+        <w:t xml:space="preserve">An additional experiment fits cross-validated pre-task routers on 5,000 published</w:t>
+      </w:r>
+      <w:r>
+        <w:t xml:space="preserve"> </w:t>
+      </w:r>
+      <w:r>
+        <w:t xml:space="preserve">agent outcomes: ten models on all 500 SWE-bench Verified tasks using mini-SWE-agent</w:t>
+      </w:r>
+      <w:r>
+        <w:t xml:space="preserve"> </w:t>
+      </w:r>
+      <w:r>
+        <w:t xml:space="preserve">2.0.0. The primary half-budget router achieves 64.2% success at US$0.2551 per task,</w:t>
+      </w:r>
+      <w:r>
+        <w:t xml:space="preserve"> </w:t>
+      </w:r>
+      <w:r>
+        <w:t xml:space="preserve">versus GPT-5.2’s 72.8% at US$0.4736. Estimated inference cost falls 46.1%, but the</w:t>
+      </w:r>
+      <w:r>
+        <w:t xml:space="preserve"> </w:t>
+      </w:r>
+      <w:r>
+        <w:t xml:space="preserve">8.6-point quality loss fails the three-point tolerance. A ten-model portfolio</w:t>
+      </w:r>
+      <w:r>
+        <w:t xml:space="preserve"> </w:t>
+      </w:r>
+      <w:r>
+        <w:t xml:space="preserve">operating point reaches 76.2% at US$0.1154; inexpensive MiniMax-M2.5 alone reaches</w:t>
+      </w:r>
+      <w:r>
+        <w:t xml:space="preserve"> </w:t>
+      </w:r>
+      <w:r>
+        <w:t xml:space="preserve">75.8% at US$0.0733. The latter comparison prevents attributing the benefits of</w:t>
+      </w:r>
+      <w:r>
+        <w:t xml:space="preserve"> </w:t>
+      </w:r>
+      <w:r>
+        <w:t xml:space="preserve">model choice to routing. These historical outcome replays are not new model</w:t>
+      </w:r>
+      <w:r>
+        <w:t xml:space="preserve"> </w:t>
+      </w:r>
+      <w:r>
+        <w:t xml:space="preserve">inference or live conversations.</w:t>
+      </w:r>
+    </w:p>
+    <w:p>
+      <w:pPr>
+        <w:pStyle w:val="BodyText"/>
+      </w:pPr>
+      <w:r>
         <w:t xml:space="preserve">The confirmatory protocol compares conversation with single-model execution,</w:t>
       </w:r>
       <w:r>
@@ -535,7 +603,19 @@
         <w:t xml:space="preserve"> </w:t>
       </w:r>
       <w:r>
-        <w:t xml:space="preserve">not cost savings, open-model capability or learning improvement.</w:t>
+        <w:t xml:space="preserve">not conversational cost savings, local-model capability or learning improvement.</w:t>
+      </w:r>
+      <w:r>
+        <w:t xml:space="preserve"> </w:t>
+      </w:r>
+      <w:r>
+        <w:t xml:space="preserve">The standard-benchmark replay supplies a reproducible negative primary result</w:t>
+      </w:r>
+      <w:r>
+        <w:t xml:space="preserve"> </w:t>
+      </w:r>
+      <w:r>
+        <w:t xml:space="preserve">and identifies a stronger low-cost standalone control for the next experiment.</w:t>
       </w:r>
     </w:p>
     <w:p>
@@ -7150,7 +7230,7 @@
     </w:p>
     <w:bookmarkEnd w:id="51"/>
     <w:bookmarkEnd w:id="52"/>
-    <w:bookmarkStart w:id="53" w:name="discussion-and-limits"/>
+    <w:bookmarkStart w:id="61" w:name="Xad43bb091bd1a71a643adee3b972bda60a74440"/>
     <w:p>
       <w:pPr>
         <w:pStyle w:val="Heading1"/>
@@ -7165,7 +7245,25 @@
         <w:tab/>
       </w:r>
       <w:r>
-        <w:t xml:space="preserve">Discussion and limits</w:t>
+        <w:t xml:space="preserve">Industry-standard benchmark: a 500-task routing replay</w:t>
+      </w:r>
+    </w:p>
+    <w:bookmarkStart w:id="53" w:name="data-and-interpretation"/>
+    <w:p>
+      <w:pPr>
+        <w:pStyle w:val="Heading2"/>
+      </w:pPr>
+      <w:r>
+        <w:rPr>
+          <w:rStyle w:val="SectionNumber"/>
+        </w:rPr>
+        <w:t xml:space="preserve">7.1</w:t>
+      </w:r>
+      <w:r>
+        <w:tab/>
+      </w:r>
+      <w:r>
+        <w:t xml:space="preserve">Data and interpretation</w:t>
       </w:r>
     </w:p>
     <w:p>
@@ -7173,865 +7271,7 @@
         <w:pStyle w:val="FirstParagraph"/>
       </w:pPr>
       <w:r>
-        <w:t xml:space="preserve">The literature makes the central hypothesis plausible without making it new or</w:t>
-      </w:r>
-      <w:r>
-        <w:t xml:space="preserve"> </w:t>
-      </w:r>
-      <w:r>
-        <w:t xml:space="preserve">settled. EdgeWise reports substantial cloud-API savings with small changes in</w:t>
-      </w:r>
-      <w:r>
-        <w:t xml:space="preserve"> </w:t>
-      </w:r>
-      <w:r>
-        <w:t xml:space="preserve">software-task performance under particular conditions, but its accounting</w:t>
-      </w:r>
-      <w:r>
-        <w:t xml:space="preserve"> </w:t>
-      </w:r>
-      <w:r>
-        <w:t xml:space="preserve">excludes the local SLM. Router-R1 and related work already make the router an</w:t>
-      </w:r>
-      <w:r>
-        <w:t xml:space="preserve"> </w:t>
-      </w:r>
-      <w:r>
-        <w:t xml:space="preserve">active participant that reasons across model responses. The present study must</w:t>
-      </w:r>
-      <w:r>
-        <w:t xml:space="preserve"> </w:t>
-      </w:r>
-      <w:r>
-        <w:t xml:space="preserve">therefore establish its value through reproducible comparisons, complete cost</w:t>
-      </w:r>
-      <w:r>
-        <w:t xml:space="preserve"> </w:t>
-      </w:r>
-      <w:r>
-        <w:t xml:space="preserve">measurement and a precise intervention, rather than the assertion that models</w:t>
-      </w:r>
-      <w:r>
-        <w:t xml:space="preserve"> </w:t>
-      </w:r>
-      <w:r>
-        <w:t xml:space="preserve">have never conversed before.</w:t>
-      </w:r>
-    </w:p>
-    <w:p>
-      <w:pPr>
-        <w:pStyle w:val="BodyText"/>
-      </w:pPr>
-      <w:r>
-        <w:t xml:space="preserve">The proposed distinction is continuing expert dialogue: an expert can ask for</w:t>
-      </w:r>
-      <w:r>
-        <w:t xml:space="preserve"> </w:t>
-      </w:r>
-      <w:r>
-        <w:t xml:space="preserve">missing evidence, challenge an interpretation and revise a proposal while the</w:t>
-      </w:r>
-      <w:r>
-        <w:t xml:space="preserve"> </w:t>
-      </w:r>
-      <w:r>
-        <w:t xml:space="preserve">small controller continues working. That may prevent context omissions and</w:t>
-      </w:r>
-      <w:r>
-        <w:t xml:space="preserve"> </w:t>
-      </w:r>
-      <w:r>
-        <w:t xml:space="preserve">uncritical acceptance. It may also waste time, encourage circular conversation</w:t>
-      </w:r>
-      <w:r>
-        <w:t xml:space="preserve"> </w:t>
-      </w:r>
-      <w:r>
-        <w:t xml:space="preserve">or amplify a shared mistake. Compare it directly with one-way assistance and</w:t>
-      </w:r>
-      <w:r>
-        <w:t xml:space="preserve"> </w:t>
-      </w:r>
-      <w:r>
-        <w:t xml:space="preserve">reset expert sessions under equal budgets. A bidirectional API alone is not a</w:t>
-      </w:r>
-      <w:r>
-        <w:t xml:space="preserve"> </w:t>
-      </w:r>
-      <w:r>
-        <w:t xml:space="preserve">scientific contribution; the empirical finding, including a negative result,</w:t>
-      </w:r>
-      <w:r>
-        <w:t xml:space="preserve"> </w:t>
-      </w:r>
-      <w:r>
-        <w:t xml:space="preserve">is the contribution.</w:t>
-      </w:r>
-    </w:p>
-    <w:p>
-      <w:pPr>
-        <w:pStyle w:val="BodyText"/>
-      </w:pPr>
-      <w:r>
-        <w:t xml:space="preserve">The pilot’s lack of optional consultations is a useful design lesson. Easy</w:t>
-      </w:r>
-      <w:r>
-        <w:t xml:space="preserve"> </w:t>
-      </w:r>
-      <w:r>
-        <w:t xml:space="preserve">tasks can show that a controller avoids unnecessary expert work, but cannot</w:t>
-      </w:r>
-      <w:r>
-        <w:t xml:space="preserve"> </w:t>
-      </w:r>
-      <w:r>
-        <w:t xml:space="preserve">evaluate its capacity to obtain help. The next development sample should span</w:t>
-      </w:r>
-      <w:r>
-        <w:t xml:space="preserve"> </w:t>
-      </w:r>
-      <w:r>
-        <w:t xml:space="preserve">observed difficulty and failure modes before the final test is frozen. It must</w:t>
-      </w:r>
-      <w:r>
-        <w:t xml:space="preserve"> </w:t>
-      </w:r>
-      <w:r>
-        <w:t xml:space="preserve">not select final tasks merely because they make conversation look useful. A</w:t>
-      </w:r>
-      <w:r>
-        <w:t xml:space="preserve"> </w:t>
-      </w:r>
-      <w:r>
-        <w:t xml:space="preserve">registered development-stratified sampling rule, followed by an untouched test</w:t>
-      </w:r>
-      <w:r>
-        <w:t xml:space="preserve"> </w:t>
-      </w:r>
-      <w:r>
-        <w:t xml:space="preserve">sample, can ensure both easy and difficult assignments without selecting on</w:t>
-      </w:r>
-      <w:r>
-        <w:t xml:space="preserve"> </w:t>
-      </w:r>
-      <w:r>
-        <w:t xml:space="preserve">final-treatment outcomes.</w:t>
-      </w:r>
-    </w:p>
-    <w:p>
-      <w:pPr>
-        <w:pStyle w:val="BodyText"/>
-      </w:pPr>
-      <w:r>
-        <w:t xml:space="preserve">The artifact-policy problem also matters. In a product, adding a good test to an</w:t>
-      </w:r>
-      <w:r>
-        <w:t xml:space="preserve"> </w:t>
-      </w:r>
-      <w:r>
-        <w:t xml:space="preserve">existing file is usually desirable. In a controlled repair benchmark, altering</w:t>
-      </w:r>
-      <w:r>
-        <w:t xml:space="preserve"> </w:t>
-      </w:r>
-      <w:r>
-        <w:t xml:space="preserve">the tests used for evaluation can invalidate success. The next protocol should</w:t>
-      </w:r>
-      <w:r>
-        <w:t xml:space="preserve"> </w:t>
-      </w:r>
-      <w:r>
-        <w:t xml:space="preserve">make that distinction explicit: immutable evaluator tests are outside the</w:t>
-      </w:r>
-      <w:r>
-        <w:t xml:space="preserve"> </w:t>
-      </w:r>
-      <w:r>
-        <w:t xml:space="preserve">worker, while permitted public-test additions are reviewed or applied under a</w:t>
-      </w:r>
-      <w:r>
-        <w:t xml:space="preserve"> </w:t>
-      </w:r>
-      <w:r>
-        <w:t xml:space="preserve">declared patch policy. The current frozen results remain intact. Reinterpreting</w:t>
-      </w:r>
-      <w:r>
-        <w:t xml:space="preserve"> </w:t>
-      </w:r>
-      <w:r>
-        <w:t xml:space="preserve">them as proof that conversational agents cannot follow constraints would be</w:t>
-      </w:r>
-      <w:r>
-        <w:t xml:space="preserve"> </w:t>
-      </w:r>
-      <w:r>
-        <w:t xml:space="preserve">unwarranted given the prompt ambiguity and tiny sample.</w:t>
-      </w:r>
-    </w:p>
-    <w:p>
-      <w:pPr>
-        <w:pStyle w:val="BodyText"/>
-      </w:pPr>
-      <w:r>
-        <w:t xml:space="preserve">Personalization and long-term learning remain optional, separable questions.</w:t>
-      </w:r>
-      <w:r>
-        <w:t xml:space="preserve"> </w:t>
-      </w:r>
-      <w:r>
-        <w:t xml:space="preserve">Editable memory has practical value as a user interface, but it does not</w:t>
-      </w:r>
-      <w:r>
-        <w:t xml:space="preserve"> </w:t>
-      </w:r>
-      <w:r>
-        <w:t xml:space="preserve">automatically improve task success. Existing developer-skill research motivates</w:t>
-      </w:r>
-      <w:r>
-        <w:t xml:space="preserve"> </w:t>
-      </w:r>
-      <w:r>
-        <w:t xml:space="preserve">generic and shuffled-user controls. RL can improve decisions without providing</w:t>
-      </w:r>
-      <w:r>
-        <w:t xml:space="preserve"> </w:t>
-      </w:r>
-      <w:r>
-        <w:t xml:space="preserve">an economical training path at small scale. Training cost, privacy boundaries,</w:t>
-      </w:r>
-      <w:r>
-        <w:t xml:space="preserve"> </w:t>
-      </w:r>
-      <w:r>
-        <w:t xml:space="preserve">feedback reliability and retained local capability must be measured. The</w:t>
-      </w:r>
-      <w:r>
-        <w:t xml:space="preserve"> </w:t>
-      </w:r>
-      <w:r>
-        <w:t xml:space="preserve">current code uses no model-weight update, and the live Codex experiment has no</w:t>
-      </w:r>
-      <w:r>
-        <w:t xml:space="preserve"> </w:t>
-      </w:r>
-      <w:r>
-        <w:t xml:space="preserve">access to the hosted models’ weights.</w:t>
-      </w:r>
-    </w:p>
-    <w:p>
-      <w:pPr>
-        <w:pStyle w:val="BodyText"/>
-      </w:pPr>
-      <w:r>
-        <w:t xml:space="preserve">More agents can supply complementary expertise, but also introduce duplicate</w:t>
-      </w:r>
-      <w:r>
-        <w:t xml:space="preserve"> </w:t>
-      </w:r>
-      <w:r>
-        <w:t xml:space="preserve">work and harder credit assignment. The minimal dyadic design should establish</w:t>
-      </w:r>
-      <w:r>
-        <w:t xml:space="preserve"> </w:t>
-      </w:r>
-      <w:r>
-        <w:t xml:space="preserve">when conversation helps before a many-to-many experiment claims emergent roles</w:t>
-      </w:r>
-      <w:r>
-        <w:t xml:space="preserve"> </w:t>
-      </w:r>
-      <w:r>
-        <w:t xml:space="preserve">or self-improvement. Existing graph and multi-agent learning frameworks should</w:t>
-      </w:r>
-      <w:r>
-        <w:t xml:space="preserve"> </w:t>
-      </w:r>
-      <w:r>
-        <w:t xml:space="preserve">be reused for that extension. The long-term ambition remains affordable,</w:t>
-      </w:r>
-      <w:r>
-        <w:t xml:space="preserve"> </w:t>
-      </w:r>
-      <w:r>
-        <w:t xml:space="preserve">user-controlled AI; that social objective is not demonstrated by a four-task</w:t>
-      </w:r>
-      <w:r>
-        <w:t xml:space="preserve"> </w:t>
-      </w:r>
-      <w:r>
-        <w:t xml:space="preserve">hosted-model pilot.</w:t>
-      </w:r>
-    </w:p>
-    <w:bookmarkEnd w:id="53"/>
-    <w:bookmarkStart w:id="54" w:name="reproducibility-and-next-execution"/>
-    <w:p>
-      <w:pPr>
-        <w:pStyle w:val="Heading1"/>
-      </w:pPr>
-      <w:r>
-        <w:rPr>
-          <w:rStyle w:val="SectionNumber"/>
-        </w:rPr>
-        <w:t xml:space="preserve">8</w:t>
-      </w:r>
-      <w:r>
-        <w:tab/>
-      </w:r>
-      <w:r>
-        <w:t xml:space="preserve">Reproducibility and next execution</w:t>
-      </w:r>
-    </w:p>
-    <w:p>
-      <w:pPr>
-        <w:pStyle w:val="FirstParagraph"/>
-      </w:pPr>
-      <w:r>
-        <w:t xml:space="preserve">The repository contains the full protocol and adapted benchmark provenance,</w:t>
-      </w:r>
-      <w:r>
-        <w:t xml:space="preserve"> </w:t>
-      </w:r>
-      <w:r>
-        <w:t xml:space="preserve">separate task workspaces, immutable grader source, regression reports, submitted</w:t>
-      </w:r>
-      <w:r>
-        <w:t xml:space="preserve"> </w:t>
-      </w:r>
-      <w:r>
-        <w:t xml:space="preserve">patches, nullable-cost records, dialogue transcript and analysis code. It also</w:t>
-      </w:r>
-      <w:r>
-        <w:t xml:space="preserve"> </w:t>
-      </w:r>
-      <w:r>
-        <w:t xml:space="preserve">contains a tested restore command that verifies downloaded archive hashes and</w:t>
-      </w:r>
-      <w:r>
-        <w:t xml:space="preserve"> </w:t>
-      </w:r>
-      <w:r>
-        <w:t xml:space="preserve">replays all buggy/fixed controls before creating new worker copies. It refuses</w:t>
-      </w:r>
-      <w:r>
-        <w:t xml:space="preserve"> </w:t>
-      </w:r>
-      <w:r>
-        <w:t xml:space="preserve">to overwrite existing destinations. The original source and evaluator trees</w:t>
-      </w:r>
-      <w:r>
-        <w:t xml:space="preserve"> </w:t>
-      </w:r>
-      <w:r>
-        <w:t xml:space="preserve">are checked against their manifest before grading.</w:t>
-      </w:r>
-    </w:p>
-    <w:p>
-      <w:pPr>
-        <w:pStyle w:val="BodyText"/>
-      </w:pPr>
-      <w:r>
-        <w:t xml:space="preserve">From a prepared research environment, the recorded analysis can be reproduced</w:t>
-      </w:r>
-      <w:r>
-        <w:t xml:space="preserve"> </w:t>
-      </w:r>
-      <w:r>
-        <w:t xml:space="preserve">without any model calls:</w:t>
-      </w:r>
-    </w:p>
-    <w:p>
-      <w:pPr>
-        <w:pStyle w:val="SourceCode"/>
-      </w:pPr>
-      <w:r>
-        <w:rPr>
-          <w:rStyle w:val="ExtensionTok"/>
-        </w:rPr>
-        <w:t xml:space="preserve">python</w:t>
-      </w:r>
-      <w:r>
-        <w:rPr>
-          <w:rStyle w:val="NormalTok"/>
-        </w:rPr>
-        <w:t xml:space="preserve"> scripts/analyze_codex_pilot.py </w:t>
-      </w:r>
-      <w:r>
-        <w:rPr>
-          <w:rStyle w:val="AttributeTok"/>
-        </w:rPr>
-        <w:t xml:space="preserve">--output-dir</w:t>
-      </w:r>
-      <w:r>
-        <w:rPr>
-          <w:rStyle w:val="NormalTok"/>
-        </w:rPr>
-        <w:t xml:space="preserve"> results/my-pilot-analysis</w:t>
-      </w:r>
-      <w:r>
-        <w:br/>
-      </w:r>
-      <w:r>
-        <w:rPr>
-          <w:rStyle w:val="ExtensionTok"/>
-        </w:rPr>
-        <w:t xml:space="preserve">python</w:t>
-      </w:r>
-      <w:r>
-        <w:rPr>
-          <w:rStyle w:val="NormalTok"/>
-        </w:rPr>
-        <w:t xml:space="preserve"> </w:t>
-      </w:r>
-      <w:r>
-        <w:rPr>
-          <w:rStyle w:val="AttributeTok"/>
-        </w:rPr>
-        <w:t xml:space="preserve">-m</w:t>
-      </w:r>
-      <w:r>
-        <w:rPr>
-          <w:rStyle w:val="NormalTok"/>
-        </w:rPr>
-        <w:t xml:space="preserve"> pytest </w:t>
-      </w:r>
-      <w:r>
-        <w:rPr>
-          <w:rStyle w:val="AttributeTok"/>
-        </w:rPr>
-        <w:t xml:space="preserve">-q</w:t>
-      </w:r>
-    </w:p>
-    <w:p>
-      <w:pPr>
-        <w:pStyle w:val="FirstParagraph"/>
-      </w:pPr>
-      <w:r>
-        <w:t xml:space="preserve">On a fresh compatible workspace, restore the historical benchmark fixtures:</w:t>
-      </w:r>
-    </w:p>
-    <w:p>
-      <w:pPr>
-        <w:pStyle w:val="SourceCode"/>
-      </w:pPr>
-      <w:r>
-        <w:rPr>
-          <w:rStyle w:val="ExtensionTok"/>
-        </w:rPr>
-        <w:t xml:space="preserve">python</w:t>
-      </w:r>
-      <w:r>
-        <w:rPr>
-          <w:rStyle w:val="NormalTok"/>
-        </w:rPr>
-        <w:t xml:space="preserve"> scripts/restore_codex_pilot.py </w:t>
-      </w:r>
-      <w:r>
-        <w:rPr>
-          <w:rStyle w:val="AttributeTok"/>
-        </w:rPr>
-        <w:t xml:space="preserve">--install-env</w:t>
-      </w:r>
-      <w:r>
-        <w:br/>
-      </w:r>
-      <w:r>
-        <w:rPr>
-          <w:rStyle w:val="ExtensionTok"/>
-        </w:rPr>
-        <w:t xml:space="preserve">python</w:t>
-      </w:r>
-      <w:r>
-        <w:rPr>
-          <w:rStyle w:val="NormalTok"/>
-        </w:rPr>
-        <w:t xml:space="preserve"> scripts/restore_codex_pilot.py </w:t>
-      </w:r>
-      <w:r>
-        <w:rPr>
-          <w:rStyle w:val="AttributeTok"/>
-        </w:rPr>
-        <w:t xml:space="preserve">--verify-only</w:t>
-      </w:r>
-    </w:p>
-    <w:p>
-      <w:pPr>
-        <w:pStyle w:val="FirstParagraph"/>
-      </w:pPr>
-      <w:r>
-        <w:t xml:space="preserve">The analysis command requires the research dependencies in</w:t>
-      </w:r>
-      <w:r>
-        <w:t xml:space="preserve"> </w:t>
-      </w:r>
-      <w:r>
-        <w:rPr>
-          <w:rStyle w:val="VerbatimChar"/>
-        </w:rPr>
-        <w:t xml:space="preserve">requirements-research.lock</w:t>
-      </w:r>
-      <w:r>
-        <w:t xml:space="preserve">. Restore uses its separately pinned CPython 3.8.20</w:t>
-      </w:r>
-      <w:r>
-        <w:t xml:space="preserve"> </w:t>
-      </w:r>
-      <w:r>
-        <w:t xml:space="preserve">environment and legacy test dependencies, and downloads the exact registered</w:t>
-      </w:r>
-      <w:r>
-        <w:t xml:space="preserve"> </w:t>
-      </w:r>
-      <w:r>
-        <w:t xml:space="preserve">public archives. The study is deliberately an adapted BugsInPy subset; the</w:t>
-      </w:r>
-      <w:r>
-        <w:t xml:space="preserve"> </w:t>
-      </w:r>
-      <w:r>
-        <w:t xml:space="preserve">restore process does not claim to recreate every original benchmark environment.</w:t>
-      </w:r>
-      <w:r>
-        <w:t xml:space="preserve"> </w:t>
-      </w:r>
-      <w:r>
-        <w:t xml:space="preserve">Do not execute new models in the recorded solved worker copies.</w:t>
-      </w:r>
-    </w:p>
-    <w:p>
-      <w:pPr>
-        <w:pStyle w:val="BodyText"/>
-      </w:pPr>
-      <w:r>
-        <w:t xml:space="preserve">For a normal machine with a writable, authenticated Codex installation, the</w:t>
-      </w:r>
-      <w:r>
-        <w:t xml:space="preserve"> </w:t>
-      </w:r>
-      <w:r>
-        <w:t xml:space="preserve">reusable adapter accepts a task manifest and a new output directory:</w:t>
-      </w:r>
-    </w:p>
-    <w:p>
-      <w:pPr>
-        <w:pStyle w:val="SourceCode"/>
-      </w:pPr>
-      <w:r>
-        <w:rPr>
-          <w:rStyle w:val="ExtensionTok"/>
-        </w:rPr>
-        <w:t xml:space="preserve">python</w:t>
-      </w:r>
-      <w:r>
-        <w:rPr>
-          <w:rStyle w:val="NormalTok"/>
-        </w:rPr>
-        <w:t xml:space="preserve"> </w:t>
-      </w:r>
-      <w:r>
-        <w:rPr>
-          <w:rStyle w:val="AttributeTok"/>
-        </w:rPr>
-        <w:t xml:space="preserve">-m</w:t>
-      </w:r>
-      <w:r>
-        <w:rPr>
-          <w:rStyle w:val="NormalTok"/>
-        </w:rPr>
-        <w:t xml:space="preserve"> ttgl.personal </w:t>
-      </w:r>
-      <w:r>
-        <w:rPr>
-          <w:rStyle w:val="AttributeTok"/>
-        </w:rPr>
-        <w:t xml:space="preserve">--task</w:t>
-      </w:r>
-      <w:r>
-        <w:rPr>
-          <w:rStyle w:val="NormalTok"/>
-        </w:rPr>
-        <w:t xml:space="preserve"> task.json </w:t>
-      </w:r>
-      <w:r>
-        <w:rPr>
-          <w:rStyle w:val="AttributeTok"/>
-        </w:rPr>
-        <w:t xml:space="preserve">--condition</w:t>
-      </w:r>
-      <w:r>
-        <w:rPr>
-          <w:rStyle w:val="NormalTok"/>
-        </w:rPr>
-        <w:t xml:space="preserve"> personal </w:t>
-      </w:r>
-      <w:r>
-        <w:rPr>
-          <w:rStyle w:val="DataTypeTok"/>
-        </w:rPr>
-        <w:t xml:space="preserve">\</w:t>
-      </w:r>
-      <w:r>
-        <w:br/>
-      </w:r>
-      <w:r>
-        <w:rPr>
-          <w:rStyle w:val="NormalTok"/>
-        </w:rPr>
-        <w:t xml:space="preserve">  </w:t>
-      </w:r>
-      <w:r>
-        <w:rPr>
-          <w:rStyle w:val="AttributeTok"/>
-        </w:rPr>
-        <w:t xml:space="preserve">--small-model</w:t>
-      </w:r>
-      <w:r>
-        <w:rPr>
-          <w:rStyle w:val="NormalTok"/>
-        </w:rPr>
-        <w:t xml:space="preserve"> gpt-6-luna </w:t>
-      </w:r>
-      <w:r>
-        <w:rPr>
-          <w:rStyle w:val="AttributeTok"/>
-        </w:rPr>
-        <w:t xml:space="preserve">--large-model</w:t>
-      </w:r>
-      <w:r>
-        <w:rPr>
-          <w:rStyle w:val="NormalTok"/>
-        </w:rPr>
-        <w:t xml:space="preserve"> gpt-6.1-sol </w:t>
-      </w:r>
-      <w:r>
-        <w:rPr>
-          <w:rStyle w:val="DataTypeTok"/>
-        </w:rPr>
-        <w:t xml:space="preserve">\</w:t>
-      </w:r>
-      <w:r>
-        <w:br/>
-      </w:r>
-      <w:r>
-        <w:rPr>
-          <w:rStyle w:val="NormalTok"/>
-        </w:rPr>
-        <w:t xml:space="preserve">  </w:t>
-      </w:r>
-      <w:r>
-        <w:rPr>
-          <w:rStyle w:val="AttributeTok"/>
-        </w:rPr>
-        <w:t xml:space="preserve">--max-expert-calls</w:t>
-      </w:r>
-      <w:r>
-        <w:rPr>
-          <w:rStyle w:val="NormalTok"/>
-        </w:rPr>
-        <w:t xml:space="preserve"> 2 </w:t>
-      </w:r>
-      <w:r>
-        <w:rPr>
-          <w:rStyle w:val="AttributeTok"/>
-        </w:rPr>
-        <w:t xml:space="preserve">--timeout-seconds</w:t>
-      </w:r>
-      <w:r>
-        <w:rPr>
-          <w:rStyle w:val="NormalTok"/>
-        </w:rPr>
-        <w:t xml:space="preserve"> 240 </w:t>
-      </w:r>
-      <w:r>
-        <w:rPr>
-          <w:rStyle w:val="DataTypeTok"/>
-        </w:rPr>
-        <w:t xml:space="preserve">\</w:t>
-      </w:r>
-      <w:r>
-        <w:br/>
-      </w:r>
-      <w:r>
-        <w:rPr>
-          <w:rStyle w:val="NormalTok"/>
-        </w:rPr>
-        <w:t xml:space="preserve">  </w:t>
-      </w:r>
-      <w:r>
-        <w:rPr>
-          <w:rStyle w:val="AttributeTok"/>
-        </w:rPr>
-        <w:t xml:space="preserve">--output-dir</w:t>
-      </w:r>
-      <w:r>
-        <w:rPr>
-          <w:rStyle w:val="NormalTok"/>
-        </w:rPr>
-        <w:t xml:space="preserve"> artifacts/new-conversation</w:t>
-      </w:r>
-    </w:p>
-    <w:p>
-      <w:pPr>
-        <w:pStyle w:val="FirstParagraph"/>
-      </w:pPr>
-      <w:r>
-        <w:t xml:space="preserve">The runbook documents the exact supported arguments, structured responses,</w:t>
-      </w:r>
-      <w:r>
-        <w:t xml:space="preserve"> </w:t>
-      </w:r>
-      <w:r>
-        <w:t xml:space="preserve">resumed threads, failure disposition and grading boundary. Completion means</w:t>
-      </w:r>
-      <w:r>
-        <w:t xml:space="preserve"> </w:t>
-      </w:r>
-      <w:r>
-        <w:t xml:space="preserve">the controller finished; it does not automatically mean the issue was resolved.</w:t>
-      </w:r>
-      <w:r>
-        <w:t xml:space="preserve"> </w:t>
-      </w:r>
-      <w:r>
-        <w:t xml:space="preserve">A unit-tested fake backend verifies the control flow without pretending to be</w:t>
-      </w:r>
-      <w:r>
-        <w:t xml:space="preserve"> </w:t>
-      </w:r>
-      <w:r>
-        <w:t xml:space="preserve">an LLM. The installed standalone CLI’s read-only-state failure in the present</w:t>
-      </w:r>
-      <w:r>
-        <w:t xml:space="preserve"> </w:t>
-      </w:r>
-      <w:r>
-        <w:t xml:space="preserve">managed session remains a known runtime limitation. The actual live trials used</w:t>
-      </w:r>
-      <w:r>
-        <w:t xml:space="preserve"> </w:t>
-      </w:r>
-      <w:r>
-        <w:t xml:space="preserve">the collaboration tool instead and do not establish CLI service readiness.</w:t>
-      </w:r>
-    </w:p>
-    <w:p>
-      <w:pPr>
-        <w:pStyle w:val="BodyText"/>
-      </w:pPr>
-      <w:r>
-        <w:t xml:space="preserve">The next performance experiment requires a larger frozen task sample, strong</w:t>
-      </w:r>
-      <w:r>
-        <w:t xml:space="preserve"> </w:t>
-      </w:r>
-      <w:r>
-        <w:t xml:space="preserve">worker/evaluator isolation, unambiguous artifact rules, a native one-way</w:t>
-      </w:r>
-      <w:r>
-        <w:t xml:space="preserve"> </w:t>
-      </w:r>
-      <w:r>
-        <w:t xml:space="preserve">assistance comparator and observable billing. It can use existing hosted Codex</w:t>
-      </w:r>
-      <w:r>
-        <w:t xml:space="preserve"> </w:t>
-      </w:r>
-      <w:r>
-        <w:t xml:space="preserve">agents if their usage can be recorded, or compatible open models through an</w:t>
-      </w:r>
-      <w:r>
-        <w:t xml:space="preserve"> </w:t>
-      </w:r>
-      <w:r>
-        <w:t xml:space="preserve">existing serving stack. A faithful reproduction of prior large-scale training</w:t>
-      </w:r>
-      <w:r>
-        <w:t xml:space="preserve"> </w:t>
-      </w:r>
-      <w:r>
-        <w:t xml:space="preserve">requires additional resources; it is not silently charged to the existing</w:t>
-      </w:r>
-      <w:r>
-        <w:t xml:space="preserve"> </w:t>
-      </w:r>
-      <w:r>
-        <w:t xml:space="preserve">US$100 Runpod allocation. No new credential is needed to reproduce the recorded</w:t>
-      </w:r>
-      <w:r>
-        <w:t xml:space="preserve"> </w:t>
-      </w:r>
-      <w:r>
-        <w:t xml:space="preserve">analysis. Credentials and connectivity are still required for future paid GPU</w:t>
-      </w:r>
-      <w:r>
-        <w:t xml:space="preserve"> </w:t>
-      </w:r>
-      <w:r>
-        <w:t xml:space="preserve">or provider runs.</w:t>
-      </w:r>
-    </w:p>
-    <w:p>
-      <w:pPr>
-        <w:pStyle w:val="BodyText"/>
-      </w:pPr>
-      <w:r>
-        <w:t xml:space="preserve">Fastest Jira and Confluence synchronization remain unavailable in the current</w:t>
-      </w:r>
-      <w:r>
-        <w:t xml:space="preserve"> </w:t>
-      </w:r>
-      <w:r>
-        <w:t xml:space="preserve">tool set. Local task records and an import CSV preserve progress; they are not</w:t>
-      </w:r>
-      <w:r>
-        <w:t xml:space="preserve"> </w:t>
-      </w:r>
-      <w:r>
-        <w:t xml:space="preserve">remote issue keys or evidence of publication. The intended Confluence destination</w:t>
-      </w:r>
-      <w:r>
-        <w:t xml:space="preserve"> </w:t>
-      </w:r>
-      <w:r>
-        <w:t xml:space="preserve">remains the FASTEST space at fastestswarm.atlassian.net.</w:t>
-      </w:r>
-    </w:p>
-    <w:bookmarkEnd w:id="54"/>
-    <w:bookmarkStart w:id="55" w:name="conclusion"/>
-    <w:p>
-      <w:pPr>
-        <w:pStyle w:val="Heading1"/>
-      </w:pPr>
-      <w:r>
-        <w:rPr>
-          <w:rStyle w:val="SectionNumber"/>
-        </w:rPr>
-        <w:t xml:space="preserve">9</w:t>
-      </w:r>
-      <w:r>
-        <w:tab/>
-      </w:r>
-      <w:r>
-        <w:t xml:space="preserve">Conclusion</w:t>
-      </w:r>
-    </w:p>
-    <w:p>
-      <w:pPr>
-        <w:pStyle w:val="FirstParagraph"/>
-      </w:pPr>
-      <w:r>
-        <w:t xml:space="preserve">Small-model-led collaboration is established prior art, including learned</w:t>
-      </w:r>
-      <w:r>
-        <w:t xml:space="preserve"> </w:t>
-      </w:r>
-      <w:r>
-        <w:t xml:space="preserve">delegation for software engineering. The defensible hypothesis is whether</w:t>
-      </w:r>
-      <w:r>
-        <w:t xml:space="preserve"> </w:t>
-      </w:r>
-      <w:r>
-        <w:t xml:space="preserve">continuing, bounded conversation achieves materially lower</w:t>
+        <w:t xml:space="preserve">We executed a new routing analysis on</w:t>
       </w:r>
       <w:r>
         <w:t xml:space="preserve"> </w:t>
@@ -8041,6 +7281,3114 @@
           <w:b/>
           <w:bCs/>
         </w:rPr>
+        <w:t xml:space="preserve">all 500 SWE-bench Verified tasks</w:t>
+      </w:r>
+      <w:r>
+        <w:t xml:space="preserve">, using</w:t>
+      </w:r>
+      <w:r>
+        <w:t xml:space="preserve"> </w:t>
+      </w:r>
+      <w:r>
+        <w:t xml:space="preserve">the ten complete public submissions dated 17 February 2026 in the official</w:t>
+      </w:r>
+      <w:r>
+        <w:t xml:space="preserve"> </w:t>
+      </w:r>
+      <w:r>
+        <w:t xml:space="preserve">SWE-bench experiments repository</w:t>
+      </w:r>
+      <w:r>
+        <w:t xml:space="preserve"> </w:t>
+      </w:r>
+      <w:r>
+        <w:t xml:space="preserve">(</w:t>
+      </w:r>
+      <w:hyperlink w:anchor="ref-ttglsweexperiments2026">
+        <w:r>
+          <w:rPr>
+            <w:rStyle w:val="Hyperlink"/>
+          </w:rPr>
+          <w:t xml:space="preserve">SWE-bench maintainers and submission authors 2026</w:t>
+        </w:r>
+      </w:hyperlink>
+      <w:r>
+        <w:t xml:space="preserve">)</w:t>
+      </w:r>
+      <w:r>
+        <w:t xml:space="preserve">. Each submission uses</w:t>
+      </w:r>
+      <w:r>
+        <w:t xml:space="preserve"> </w:t>
+      </w:r>
+      <w:r>
+        <w:t xml:space="preserve">mini-SWE-agent 2.0.0 and supplies per-instance resolution, estimated inference</w:t>
+      </w:r>
+      <w:r>
+        <w:t xml:space="preserve"> </w:t>
+      </w:r>
+      <w:r>
+        <w:t xml:space="preserve">cost and API-call counts. This gives 5,000 recorded model–task outcomes, not</w:t>
+      </w:r>
+      <w:r>
+        <w:t xml:space="preserve"> </w:t>
+      </w:r>
+      <w:r>
+        <w:t xml:space="preserve">5,000 independent tasks. Costs and accuracies reconcile to every submission’s</w:t>
+      </w:r>
+      <w:r>
+        <w:t xml:space="preserve"> </w:t>
+      </w:r>
+      <w:r>
+        <w:t xml:space="preserve">published metadata. The source revision is</w:t>
+      </w:r>
+      <w:r>
+        <w:t xml:space="preserve"> </w:t>
+      </w:r>
+      <w:r>
+        <w:rPr>
+          <w:rStyle w:val="VerbatimChar"/>
+        </w:rPr>
+        <w:t xml:space="preserve">40f164d5b8f1d249bf95a6df8b74b577fd8e519d</w:t>
+      </w:r>
+      <w:r>
+        <w:t xml:space="preserve">; task text comes from the official task</w:t>
+      </w:r>
+      <w:r>
+        <w:t xml:space="preserve"> </w:t>
+      </w:r>
+      <w:r>
+        <w:t xml:space="preserve">repository at</w:t>
+      </w:r>
+      <w:r>
+        <w:t xml:space="preserve"> </w:t>
+      </w:r>
+      <w:r>
+        <w:rPr>
+          <w:rStyle w:val="VerbatimChar"/>
+        </w:rPr>
+        <w:t xml:space="preserve">3d07b464b7b311a0cbfb5ed5b2d8a3b96f84a33d</w:t>
+      </w:r>
+      <w:r>
+        <w:t xml:space="preserve">.</w:t>
+      </w:r>
+      <w:r>
+        <w:t xml:space="preserve"> </w:t>
+      </w:r>
+      <w:r>
+        <w:t xml:space="preserve">Canonical task identifiers join the records. We did not independently establish</w:t>
+      </w:r>
+      <w:r>
+        <w:t xml:space="preserve"> </w:t>
+      </w:r>
+      <w:r>
+        <w:t xml:space="preserve">that this later task-text snapshot is byte-identical to every original model</w:t>
+      </w:r>
+      <w:r>
+        <w:t xml:space="preserve"> </w:t>
+      </w:r>
+      <w:r>
+        <w:t xml:space="preserve">prompt used in February.</w:t>
+      </w:r>
+    </w:p>
+    <w:p>
+      <w:pPr>
+        <w:pStyle w:val="BodyText"/>
+      </w:pPr>
+      <w:r>
+        <w:t xml:space="preserve">These are</w:t>
+      </w:r>
+      <w:r>
+        <w:t xml:space="preserve"> </w:t>
+      </w:r>
+      <w:r>
+        <w:rPr>
+          <w:b/>
+          <w:bCs/>
+        </w:rPr>
+        <w:t xml:space="preserve">new router fits and outcome replays of previously executed agents</w:t>
+      </w:r>
+      <w:r>
+        <w:t xml:space="preserve">.</w:t>
+      </w:r>
+      <w:r>
+        <w:t xml:space="preserve"> </w:t>
+      </w:r>
+      <w:r>
+        <w:t xml:space="preserve">We did not rerun those ten models, infer unseen patches, or observe their current</w:t>
+      </w:r>
+      <w:r>
+        <w:t xml:space="preserve"> </w:t>
+      </w:r>
+      <w:r>
+        <w:t xml:space="preserve">prices. Their historical outcomes are held fixed while we select among them.</w:t>
+      </w:r>
+      <w:r>
+        <w:t xml:space="preserve"> </w:t>
+      </w:r>
+      <w:r>
+        <w:t xml:space="preserve">This experiment measures the cost–quality opportunities and limits of pre-task</w:t>
+      </w:r>
+      <w:r>
+        <w:t xml:space="preserve"> </w:t>
+      </w:r>
+      <w:r>
+        <w:t xml:space="preserve">selection in this portfolio. It does not identify the effect of bidirectional</w:t>
+      </w:r>
+      <w:r>
+        <w:t xml:space="preserve"> </w:t>
+      </w:r>
+      <w:r>
+        <w:t xml:space="preserve">communication, distillation, local inference or Codex subscription consumption.</w:t>
+      </w:r>
+      <w:r>
+        <w:t xml:space="preserve"> </w:t>
+      </w:r>
+      <w:r>
+        <w:t xml:space="preserve">Same-harness-version comparisons still differ in model-specific settings,</w:t>
+      </w:r>
+      <w:r>
+        <w:t xml:space="preserve"> </w:t>
+      </w:r>
+      <w:r>
+        <w:t xml:space="preserve">reasoning effort, service behavior and potentially execution conditions.</w:t>
+      </w:r>
+    </w:p>
+    <w:p>
+      <w:pPr>
+        <w:pStyle w:val="BodyText"/>
+      </w:pPr>
+      <w:r>
+        <w:t xml:space="preserve">The protocol and model grid were frozen before fitting. Aggregate source</w:t>
+      </w:r>
+      <w:r>
+        <w:t xml:space="preserve"> </w:t>
+      </w:r>
+      <w:r>
+        <w:t xml:space="preserve">accuracies and prices had already been inspected during dataset selection, so</w:t>
+      </w:r>
+      <w:r>
+        <w:t xml:space="preserve"> </w:t>
+      </w:r>
+      <w:r>
+        <w:t xml:space="preserve">this is exploratory secondary analysis,</w:t>
+      </w:r>
+      <w:r>
+        <w:t xml:space="preserve"> </w:t>
+      </w:r>
+      <w:r>
+        <w:rPr>
+          <w:b/>
+          <w:bCs/>
+        </w:rPr>
+        <w:t xml:space="preserve">not prospective preregistration</w:t>
+      </w:r>
+      <w:r>
+        <w:t xml:space="preserve">.</w:t>
+      </w:r>
+      <w:r>
+        <w:t xml:space="preserve"> </w:t>
+      </w:r>
+      <w:r>
+        <w:t xml:space="preserve">All scripts, source hashes, folds, numerical task records and results are</w:t>
+      </w:r>
+      <w:r>
+        <w:t xml:space="preserve"> </w:t>
+      </w:r>
+      <w:r>
+        <w:t xml:space="preserve">archived under</w:t>
+      </w:r>
+      <w:r>
+        <w:t xml:space="preserve"> </w:t>
+      </w:r>
+      <w:r>
+        <w:rPr>
+          <w:rStyle w:val="VerbatimChar"/>
+        </w:rPr>
+        <w:t xml:space="preserve">experiments/swe-replay-001</w:t>
+      </w:r>
+      <w:r>
+        <w:t xml:space="preserve"> </w:t>
+      </w:r>
+      <w:r>
+        <w:t xml:space="preserve">and</w:t>
+      </w:r>
+      <w:r>
+        <w:t xml:space="preserve"> </w:t>
+      </w:r>
+      <w:r>
+        <w:rPr>
+          <w:rStyle w:val="VerbatimChar"/>
+        </w:rPr>
+        <w:t xml:space="preserve">results/swe-replay-001</w:t>
+      </w:r>
+      <w:r>
+        <w:t xml:space="preserve">.</w:t>
+      </w:r>
+    </w:p>
+    <w:bookmarkEnd w:id="53"/>
+    <w:bookmarkStart w:id="54" w:name="routing-method-and-leakage-controls"/>
+    <w:p>
+      <w:pPr>
+        <w:pStyle w:val="Heading2"/>
+      </w:pPr>
+      <w:r>
+        <w:rPr>
+          <w:rStyle w:val="SectionNumber"/>
+        </w:rPr>
+        <w:t xml:space="preserve">7.2</w:t>
+      </w:r>
+      <w:r>
+        <w:tab/>
+      </w:r>
+      <w:r>
+        <w:t xml:space="preserve">Routing method and leakage controls</w:t>
+      </w:r>
+    </w:p>
+    <w:p>
+      <w:pPr>
+        <w:pStyle w:val="FirstParagraph"/>
+      </w:pPr>
+      <w:r>
+        <w:t xml:space="preserve">Five task folds use seed 1729. For each held-out fold, training uses only the</w:t>
+      </w:r>
+      <w:r>
+        <w:t xml:space="preserve"> </w:t>
+      </w:r>
+      <w:r>
+        <w:t xml:space="preserve">other 400 tasks. Word unigram/bigram TF–IDF, logarithmic issue length and a</w:t>
+      </w:r>
+      <w:r>
+        <w:t xml:space="preserve"> </w:t>
+      </w:r>
+      <w:r>
+        <w:t xml:space="preserve">repository indicator feed per-model logistic success predictors and ridge</w:t>
+      </w:r>
+      <w:r>
+        <w:t xml:space="preserve"> </w:t>
+      </w:r>
+      <w:r>
+        <w:t xml:space="preserve">regressors of log-transformed task cost. The vectorizer and transformations are</w:t>
+      </w:r>
+      <w:r>
+        <w:t xml:space="preserve"> </w:t>
+      </w:r>
+      <w:r>
+        <w:t xml:space="preserve">fit only on that fold’s training data. Test patches, reference solutions,</w:t>
+      </w:r>
+      <w:r>
+        <w:t xml:space="preserve"> </w:t>
+      </w:r>
+      <w:r>
+        <w:t xml:space="preserve">trajectories, actual held-out cost and held-out outcomes are excluded from</w:t>
+      </w:r>
+      <w:r>
+        <w:t xml:space="preserve"> </w:t>
+      </w:r>
+      <w:r>
+        <w:t xml:space="preserve">decision features. An instance identifier is used only for deterministic ties.</w:t>
+      </w:r>
+    </w:p>
+    <w:p>
+      <w:pPr>
+        <w:pStyle w:val="BodyText"/>
+      </w:pPr>
+      <w:r>
+        <w:t xml:space="preserve">The primary policy allocates GPT-5.2 to half the tasks and GPT-5-mini to the</w:t>
+      </w:r>
+      <w:r>
+        <w:t xml:space="preserve"> </w:t>
+      </w:r>
+      <w:r>
+        <w:t xml:space="preserve">remainder, ranked by predicted success gain per predicted incremental dollar.</w:t>
+      </w:r>
+      <w:r>
+        <w:t xml:space="preserve"> </w:t>
+      </w:r>
+      <w:r>
+        <w:t xml:space="preserve">Allocation takes place within each held-out fold. A global ranking over</w:t>
+      </w:r>
+      <w:r>
+        <w:t xml:space="preserve"> </w:t>
+      </w:r>
+      <w:r>
+        <w:t xml:space="preserve">cross-fitted predictions could otherwise let a task’s label influence competing</w:t>
+      </w:r>
+      <w:r>
+        <w:t xml:space="preserve"> </w:t>
+      </w:r>
+      <w:r>
+        <w:t xml:space="preserve">tasks’ scores through their training folds. The within-fold quota avoids that</w:t>
+      </w:r>
+      <w:r>
+        <w:t xml:space="preserve"> </w:t>
+      </w:r>
+      <w:r>
+        <w:t xml:space="preserve">indirect selection path. This is a batch allocation policy, not a validated</w:t>
+      </w:r>
+      <w:r>
+        <w:t xml:space="preserve"> </w:t>
+      </w:r>
+      <w:r>
+        <w:t xml:space="preserve">online arrival-by-arrival budget controller.</w:t>
+      </w:r>
+    </w:p>
+    <w:p>
+      <w:pPr>
+        <w:pStyle w:val="BodyText"/>
+      </w:pPr>
+      <w:r>
+        <w:t xml:space="preserve">Fixed single-model policies, random allocation, length and predicted-gain</w:t>
+      </w:r>
+      <w:r>
+        <w:t xml:space="preserve"> </w:t>
+      </w:r>
+      <w:r>
+        <w:t xml:space="preserve">baselines, a declared allocation grid, and a ten-model expected-utility grid</w:t>
+      </w:r>
+      <w:r>
+        <w:t xml:space="preserve"> </w:t>
+      </w:r>
+      <w:r>
+        <w:t xml:space="preserve">are also evaluated. Utility is predicted success minus a fixed coefficient</w:t>
+      </w:r>
+      <w:r>
+        <w:t xml:space="preserve"> </w:t>
+      </w:r>
+      <w:r>
+        <w:t xml:space="preserve">times predicted task cost. A separate subgroup uses models tagged open by the</w:t>
+      </w:r>
+      <w:r>
+        <w:t xml:space="preserve"> </w:t>
+      </w:r>
+      <w:r>
+        <w:t xml:space="preserve">source metadata; that tag is not our license audit or evidence that the models</w:t>
+      </w:r>
+      <w:r>
+        <w:t xml:space="preserve"> </w:t>
+      </w:r>
+      <w:r>
+        <w:t xml:space="preserve">run on a desktop. A label-and-cost-informed oracle is deliberately marked</w:t>
+      </w:r>
+      <w:r>
+        <w:t xml:space="preserve"> </w:t>
+      </w:r>
+      <w:r>
+        <w:t xml:space="preserve">nondeployable. Its apparent performance is an upper bound conditional on these</w:t>
+      </w:r>
+      <w:r>
+        <w:t xml:space="preserve"> </w:t>
+      </w:r>
+      <w:r>
+        <w:t xml:space="preserve">recorded attempts, never a usable router result.</w:t>
+      </w:r>
+    </w:p>
+    <w:bookmarkEnd w:id="54"/>
+    <w:bookmarkStart w:id="55" w:name="X43312b99f29218331cc13ef8479b33db8a3d840"/>
+    <w:p>
+      <w:pPr>
+        <w:pStyle w:val="Heading2"/>
+      </w:pPr>
+      <w:r>
+        <w:rPr>
+          <w:rStyle w:val="SectionNumber"/>
+        </w:rPr>
+        <w:t xml:space="preserve">7.3</w:t>
+      </w:r>
+      <w:r>
+        <w:tab/>
+      </w:r>
+      <w:r>
+        <w:t xml:space="preserve">Primary result: savings with an unacceptable quality loss</w:t>
+      </w:r>
+    </w:p>
+    <w:tbl>
+      <w:tblPr>
+        <w:tblStyle w:val="Table"/>
+        <w:tblW w:type="pct" w:w="5000"/>
+        <w:jc w:val="left"/>
+        <w:tblLayout w:type="fixed"/>
+        <w:tblLook w:firstRow="1" w:lastRow="0" w:firstColumn="0" w:lastColumn="0" w:noHBand="0" w:noVBand="0" w:val="0020"/>
+      </w:tblPr>
+      <w:tblGrid>
+        <w:gridCol w:w="1033"/>
+        <w:gridCol w:w="1377"/>
+        <w:gridCol w:w="1377"/>
+        <w:gridCol w:w="1377"/>
+        <w:gridCol w:w="1377"/>
+        <w:gridCol w:w="1377"/>
+      </w:tblGrid>
+      <w:tr>
+        <w:trPr>
+          <w:tblHeader w:val="on"/>
+        </w:trPr>
+        <w:tc>
+          <w:tcPr/>
+          <w:p>
+            <w:pPr>
+              <w:pStyle w:val="Compact"/>
+              <w:jc w:val="left"/>
+            </w:pPr>
+            <w:r>
+              <w:t xml:space="preserve">Policy</w:t>
+            </w:r>
+          </w:p>
+        </w:tc>
+        <w:tc>
+          <w:tcPr/>
+          <w:p>
+            <w:pPr>
+              <w:pStyle w:val="Compact"/>
+              <w:jc w:val="right"/>
+            </w:pPr>
+            <w:r>
+              <w:t xml:space="preserve">Resolved</w:t>
+            </w:r>
+          </w:p>
+        </w:tc>
+        <w:tc>
+          <w:tcPr/>
+          <w:p>
+            <w:pPr>
+              <w:pStyle w:val="Compact"/>
+              <w:jc w:val="right"/>
+            </w:pPr>
+            <w:r>
+              <w:t xml:space="preserve">Success</w:t>
+            </w:r>
+          </w:p>
+        </w:tc>
+        <w:tc>
+          <w:tcPr/>
+          <w:p>
+            <w:pPr>
+              <w:pStyle w:val="Compact"/>
+              <w:jc w:val="right"/>
+            </w:pPr>
+            <w:r>
+              <w:t xml:space="preserve">Estimated inference USD/task</w:t>
+            </w:r>
+          </w:p>
+        </w:tc>
+        <w:tc>
+          <w:tcPr/>
+          <w:p>
+            <w:pPr>
+              <w:pStyle w:val="Compact"/>
+              <w:jc w:val="right"/>
+            </w:pPr>
+            <w:r>
+              <w:t xml:space="preserve">USD/resolved task</w:t>
+            </w:r>
+          </w:p>
+        </w:tc>
+        <w:tc>
+          <w:tcPr/>
+          <w:p>
+            <w:pPr>
+              <w:pStyle w:val="Compact"/>
+              <w:jc w:val="right"/>
+            </w:pPr>
+            <w:r>
+              <w:t xml:space="preserve">Saving vs GPT-5.2</w:t>
+            </w:r>
+          </w:p>
+        </w:tc>
+      </w:tr>
+      <w:tr>
+        <w:tc>
+          <w:tcPr/>
+          <w:p>
+            <w:pPr>
+              <w:pStyle w:val="Compact"/>
+              <w:jc w:val="left"/>
+            </w:pPr>
+            <w:r>
+              <w:t xml:space="preserve">GPT-5-mini alone</w:t>
+            </w:r>
+          </w:p>
+        </w:tc>
+        <w:tc>
+          <w:tcPr/>
+          <w:p>
+            <w:pPr>
+              <w:pStyle w:val="Compact"/>
+              <w:jc w:val="right"/>
+            </w:pPr>
+            <w:r>
+              <w:t xml:space="preserve">281/500</w:t>
+            </w:r>
+          </w:p>
+        </w:tc>
+        <w:tc>
+          <w:tcPr/>
+          <w:p>
+            <w:pPr>
+              <w:pStyle w:val="Compact"/>
+              <w:jc w:val="right"/>
+            </w:pPr>
+            <w:r>
+              <w:t xml:space="preserve">56.2%</w:t>
+            </w:r>
+          </w:p>
+        </w:tc>
+        <w:tc>
+          <w:tcPr/>
+          <w:p>
+            <w:pPr>
+              <w:pStyle w:val="Compact"/>
+              <w:jc w:val="right"/>
+            </w:pPr>
+            <w:r>
+              <w:t xml:space="preserve">0.0472</w:t>
+            </w:r>
+          </w:p>
+        </w:tc>
+        <w:tc>
+          <w:tcPr/>
+          <w:p>
+            <w:pPr>
+              <w:pStyle w:val="Compact"/>
+              <w:jc w:val="right"/>
+            </w:pPr>
+            <w:r>
+              <w:t xml:space="preserve">0.0840</w:t>
+            </w:r>
+          </w:p>
+        </w:tc>
+        <w:tc>
+          <w:tcPr/>
+          <w:p>
+            <w:pPr>
+              <w:pStyle w:val="Compact"/>
+              <w:jc w:val="right"/>
+            </w:pPr>
+            <w:r>
+              <w:t xml:space="preserve">90.0%</w:t>
+            </w:r>
+          </w:p>
+        </w:tc>
+      </w:tr>
+      <w:tr>
+        <w:tc>
+          <w:tcPr/>
+          <w:p>
+            <w:pPr>
+              <w:pStyle w:val="Compact"/>
+              <w:jc w:val="left"/>
+            </w:pPr>
+            <w:r>
+              <w:t xml:space="preserve">GPT-5.2 alone</w:t>
+            </w:r>
+          </w:p>
+        </w:tc>
+        <w:tc>
+          <w:tcPr/>
+          <w:p>
+            <w:pPr>
+              <w:pStyle w:val="Compact"/>
+              <w:jc w:val="right"/>
+            </w:pPr>
+            <w:r>
+              <w:t xml:space="preserve">364/500</w:t>
+            </w:r>
+          </w:p>
+        </w:tc>
+        <w:tc>
+          <w:tcPr/>
+          <w:p>
+            <w:pPr>
+              <w:pStyle w:val="Compact"/>
+              <w:jc w:val="right"/>
+            </w:pPr>
+            <w:r>
+              <w:t xml:space="preserve">72.8%</w:t>
+            </w:r>
+          </w:p>
+        </w:tc>
+        <w:tc>
+          <w:tcPr/>
+          <w:p>
+            <w:pPr>
+              <w:pStyle w:val="Compact"/>
+              <w:jc w:val="right"/>
+            </w:pPr>
+            <w:r>
+              <w:t xml:space="preserve">0.4736</w:t>
+            </w:r>
+          </w:p>
+        </w:tc>
+        <w:tc>
+          <w:tcPr/>
+          <w:p>
+            <w:pPr>
+              <w:pStyle w:val="Compact"/>
+              <w:jc w:val="right"/>
+            </w:pPr>
+            <w:r>
+              <w:t xml:space="preserve">0.6505</w:t>
+            </w:r>
+          </w:p>
+        </w:tc>
+        <w:tc>
+          <w:tcPr/>
+          <w:p>
+            <w:pPr>
+              <w:pStyle w:val="Compact"/>
+              <w:jc w:val="right"/>
+            </w:pPr>
+            <w:r>
+              <w:t xml:space="preserve">Reference</w:t>
+            </w:r>
+          </w:p>
+        </w:tc>
+      </w:tr>
+      <w:tr>
+        <w:tc>
+          <w:tcPr/>
+          <w:p>
+            <w:pPr>
+              <w:pStyle w:val="Compact"/>
+              <w:jc w:val="left"/>
+            </w:pPr>
+            <w:r>
+              <w:t xml:space="preserve">Expected random 50% mixture</w:t>
+            </w:r>
+          </w:p>
+        </w:tc>
+        <w:tc>
+          <w:tcPr/>
+          <w:p>
+            <w:pPr>
+              <w:pStyle w:val="Compact"/>
+              <w:jc w:val="right"/>
+            </w:pPr>
+            <w:r>
+              <w:t xml:space="preserve">322.5 expected</w:t>
+            </w:r>
+          </w:p>
+        </w:tc>
+        <w:tc>
+          <w:tcPr/>
+          <w:p>
+            <w:pPr>
+              <w:pStyle w:val="Compact"/>
+              <w:jc w:val="right"/>
+            </w:pPr>
+            <w:r>
+              <w:t xml:space="preserve">64.5%</w:t>
+            </w:r>
+          </w:p>
+        </w:tc>
+        <w:tc>
+          <w:tcPr/>
+          <w:p>
+            <w:pPr>
+              <w:pStyle w:val="Compact"/>
+              <w:jc w:val="right"/>
+            </w:pPr>
+            <w:r>
+              <w:t xml:space="preserve">0.2604</w:t>
+            </w:r>
+          </w:p>
+        </w:tc>
+        <w:tc>
+          <w:tcPr/>
+          <w:p>
+            <w:pPr>
+              <w:pStyle w:val="Compact"/>
+              <w:jc w:val="right"/>
+            </w:pPr>
+            <w:r>
+              <w:t xml:space="preserve">0.4037</w:t>
+            </w:r>
+          </w:p>
+        </w:tc>
+        <w:tc>
+          <w:tcPr/>
+          <w:p>
+            <w:pPr>
+              <w:pStyle w:val="Compact"/>
+              <w:jc w:val="right"/>
+            </w:pPr>
+            <w:r>
+              <w:t xml:space="preserve">45.0%</w:t>
+            </w:r>
+          </w:p>
+        </w:tc>
+      </w:tr>
+      <w:tr>
+        <w:tc>
+          <w:tcPr/>
+          <w:p>
+            <w:pPr>
+              <w:pStyle w:val="Compact"/>
+              <w:jc w:val="left"/>
+            </w:pPr>
+            <w:r>
+              <w:t xml:space="preserve">Primary learned 50% router</w:t>
+            </w:r>
+          </w:p>
+        </w:tc>
+        <w:tc>
+          <w:tcPr/>
+          <w:p>
+            <w:pPr>
+              <w:pStyle w:val="Compact"/>
+              <w:jc w:val="right"/>
+            </w:pPr>
+            <w:r>
+              <w:t xml:space="preserve">321/500</w:t>
+            </w:r>
+          </w:p>
+        </w:tc>
+        <w:tc>
+          <w:tcPr/>
+          <w:p>
+            <w:pPr>
+              <w:pStyle w:val="Compact"/>
+              <w:jc w:val="right"/>
+            </w:pPr>
+            <w:r>
+              <w:t xml:space="preserve">64.2%</w:t>
+            </w:r>
+          </w:p>
+        </w:tc>
+        <w:tc>
+          <w:tcPr/>
+          <w:p>
+            <w:pPr>
+              <w:pStyle w:val="Compact"/>
+              <w:jc w:val="right"/>
+            </w:pPr>
+            <w:r>
+              <w:t xml:space="preserve">0.2551</w:t>
+            </w:r>
+          </w:p>
+        </w:tc>
+        <w:tc>
+          <w:tcPr/>
+          <w:p>
+            <w:pPr>
+              <w:pStyle w:val="Compact"/>
+              <w:jc w:val="right"/>
+            </w:pPr>
+            <w:r>
+              <w:t xml:space="preserve">0.3974</w:t>
+            </w:r>
+          </w:p>
+        </w:tc>
+        <w:tc>
+          <w:tcPr/>
+          <w:p>
+            <w:pPr>
+              <w:pStyle w:val="Compact"/>
+              <w:jc w:val="right"/>
+            </w:pPr>
+            <w:r>
+              <w:t xml:space="preserve">46.1%</w:t>
+            </w:r>
+          </w:p>
+        </w:tc>
+      </w:tr>
+    </w:tbl>
+    <w:p>
+      <w:pPr>
+        <w:pStyle w:val="BodyText"/>
+      </w:pPr>
+      <w:r>
+        <w:t xml:space="preserve">The primary router’s estimated inference total is</w:t>
+      </w:r>
+      <w:r>
+        <w:t xml:space="preserve"> </w:t>
+      </w:r>
+      <w:r>
+        <w:rPr>
+          <w:b/>
+          <w:bCs/>
+        </w:rPr>
+        <w:t xml:space="preserve">US$127.5667</w:t>
+      </w:r>
+      <w:r>
+        <w:t xml:space="preserve">, compared with</w:t>
+      </w:r>
+      <w:r>
+        <w:t xml:space="preserve"> </w:t>
+      </w:r>
+      <w:r>
+        <w:rPr>
+          <w:b/>
+          <w:bCs/>
+        </w:rPr>
+        <w:t xml:space="preserve">US$236.7835</w:t>
+      </w:r>
+      <w:r>
+        <w:t xml:space="preserve"> </w:t>
+      </w:r>
+      <w:r>
+        <w:t xml:space="preserve">for the GPT-5.2 reference on the same 500 tasks. Its 46.1% saving</w:t>
+      </w:r>
+      <w:r>
+        <w:t xml:space="preserve"> </w:t>
+      </w:r>
+      <w:r>
+        <w:t xml:space="preserve">comes with an</w:t>
+      </w:r>
+      <w:r>
+        <w:t xml:space="preserve"> </w:t>
+      </w:r>
+      <w:r>
+        <w:rPr>
+          <w:b/>
+          <w:bCs/>
+        </w:rPr>
+        <w:t xml:space="preserve">8.6 percentage-point</w:t>
+      </w:r>
+      <w:r>
+        <w:t xml:space="preserve"> </w:t>
+      </w:r>
+      <w:r>
+        <w:t xml:space="preserve">resolution loss. The paired task-bootstrap</w:t>
+      </w:r>
+      <w:r>
+        <w:t xml:space="preserve"> </w:t>
+      </w:r>
+      <w:r>
+        <w:t xml:space="preserve">95% interval for the quality difference is approximately</w:t>
+      </w:r>
+      <w:r>
+        <w:t xml:space="preserve"> </w:t>
+      </w:r>
+      <w:r>
+        <w:rPr>
+          <w:b/>
+          <w:bCs/>
+        </w:rPr>
+        <w:t xml:space="preserve">−11.6 to −5.6 points</w:t>
+      </w:r>
+      <w:r>
+        <w:t xml:space="preserve">;</w:t>
+      </w:r>
+      <w:r>
+        <w:t xml:space="preserve"> </w:t>
+      </w:r>
+      <w:r>
+        <w:t xml:space="preserve">the estimated saving interval is</w:t>
+      </w:r>
+      <w:r>
+        <w:t xml:space="preserve"> </w:t>
+      </w:r>
+      <w:r>
+        <w:rPr>
+          <w:b/>
+          <w:bCs/>
+        </w:rPr>
+        <w:t xml:space="preserve">40.8% to 51.4%</w:t>
+      </w:r>
+      <w:r>
+        <w:t xml:space="preserve">. Repository-cluster sensitivity</w:t>
+      </w:r>
+      <w:r>
+        <w:t xml:space="preserve"> </w:t>
+      </w:r>
+      <w:r>
+        <w:t xml:space="preserve">also fails the quality gate. The proposed three-point noninferiority margin is</w:t>
+      </w:r>
+      <w:r>
+        <w:t xml:space="preserve"> </w:t>
+      </w:r>
+      <w:r>
+        <w:t xml:space="preserve">not supported. This is a negative result for the primary joint target, despite</w:t>
+      </w:r>
+      <w:r>
+        <w:t xml:space="preserve"> </w:t>
+      </w:r>
+      <w:r>
+        <w:t xml:space="preserve">a substantial cost reduction.</w:t>
+      </w:r>
+    </w:p>
+    <w:p>
+      <w:pPr>
+        <w:pStyle w:val="BodyText"/>
+      </w:pPr>
+      <w:r>
+        <w:t xml:space="preserve">The learned router also does not demonstrate a useful accuracy improvement over</w:t>
+      </w:r>
+      <w:r>
+        <w:t xml:space="preserve"> </w:t>
+      </w:r>
+      <w:r>
+        <w:t xml:space="preserve">the expected random half-mixture: its paired difference is −0.3 points with a</w:t>
+      </w:r>
+      <w:r>
+        <w:t xml:space="preserve"> </w:t>
+      </w:r>
+      <w:r>
+        <w:t xml:space="preserve">task-bootstrap 95% interval from −2.4 to +1.9 points. The corresponding cost</w:t>
+      </w:r>
+      <w:r>
+        <w:t xml:space="preserve"> </w:t>
+      </w:r>
+      <w:r>
+        <w:t xml:space="preserve">ratio is 0.980, with interval 0.884 to 1.076. A cheaper policy is not useful evidence for</w:t>
+      </w:r>
+      <w:r>
+        <w:t xml:space="preserve"> </w:t>
+      </w:r>
+      <w:r>
+        <w:t xml:space="preserve">the central hypothesis when its success falls outside the declared tolerance.</w:t>
+      </w:r>
+      <w:r>
+        <w:t xml:space="preserve"> </w:t>
+      </w:r>
+      <w:r>
+        <w:t xml:space="preserve">The paired outcomes include 262 issues both models solve, 19 solved only by</w:t>
+      </w:r>
+      <w:r>
+        <w:t xml:space="preserve"> </w:t>
+      </w:r>
+      <w:r>
+        <w:t xml:space="preserve">GPT-5-mini, 102 only by GPT-5.2, and 117 by neither. The existence of complementary</w:t>
+      </w:r>
+      <w:r>
+        <w:t xml:space="preserve"> </w:t>
+      </w:r>
+      <w:r>
+        <w:t xml:space="preserve">successes does not imply that pre-task features can reliably identify them.</w:t>
+      </w:r>
+    </w:p>
+    <w:p>
+      <w:pPr>
+        <w:pStyle w:val="BodyText"/>
+      </w:pPr>
+      <w:r>
+        <w:t xml:space="preserve">The primary router’s break-even additional overhead is about US$0.2184 per task;</w:t>
+      </w:r>
+      <w:r>
+        <w:t xml:space="preserve"> </w:t>
+      </w:r>
+      <w:r>
+        <w:t xml:space="preserve">only US$0.1000 per task remains if a 25% inference-plus-overhead saving is the</w:t>
+      </w:r>
+      <w:r>
+        <w:t xml:space="preserve"> </w:t>
+      </w:r>
+      <w:r>
+        <w:t xml:space="preserve">target. Adding a hypothetical US$0.05 overhead per task lowers its saving to</w:t>
+      </w:r>
+      <w:r>
+        <w:t xml:space="preserve"> </w:t>
+      </w:r>
+      <w:r>
+        <w:t xml:space="preserve">35.6%, without repairing the observed quality loss. These overhead values are</w:t>
+      </w:r>
+      <w:r>
+        <w:t xml:space="preserve"> </w:t>
+      </w:r>
+      <w:r>
+        <w:t xml:space="preserve">sensitivity assumptions, not measured router or environment bills.</w:t>
+      </w:r>
+    </w:p>
+    <w:bookmarkEnd w:id="55"/>
+    <w:bookmarkStart w:id="59" w:name="X6c4078a4e19a429187d9a7d94870265c7d19f61"/>
+    <w:p>
+      <w:pPr>
+        <w:pStyle w:val="Heading2"/>
+      </w:pPr>
+      <w:r>
+        <w:rPr>
+          <w:rStyle w:val="SectionNumber"/>
+        </w:rPr>
+        <w:t xml:space="preserve">7.4</w:t>
+      </w:r>
+      <w:r>
+        <w:tab/>
+      </w:r>
+      <w:r>
+        <w:t xml:space="preserve">Portfolio comparison: a strong cheap single model is essential</w:t>
+      </w:r>
+    </w:p>
+    <w:p>
+      <w:pPr>
+        <w:pStyle w:val="FirstParagraph"/>
+      </w:pPr>
+      <w:r>
+        <w:t xml:space="preserve">All rows below use all 500 recorded assignments. The costs include failed</w:t>
+      </w:r>
+      <w:r>
+        <w:t xml:space="preserve"> </w:t>
+      </w:r>
+      <w:r>
+        <w:t xml:space="preserve">attempts. They are historical upstream estimates, not current provider quotes.</w:t>
+      </w:r>
+    </w:p>
+    <w:tbl>
+      <w:tblPr>
+        <w:tblStyle w:val="Table"/>
+        <w:tblW w:type="pct" w:w="5000"/>
+        <w:jc w:val="left"/>
+        <w:tblLayout w:type="fixed"/>
+        <w:tblLook w:firstRow="1" w:lastRow="0" w:firstColumn="0" w:lastColumn="0" w:noHBand="0" w:noVBand="0" w:val="0020"/>
+      </w:tblPr>
+      <w:tblGrid>
+        <w:gridCol w:w="1584"/>
+        <w:gridCol w:w="2112"/>
+        <w:gridCol w:w="2112"/>
+        <w:gridCol w:w="2112"/>
+      </w:tblGrid>
+      <w:tr>
+        <w:trPr>
+          <w:tblHeader w:val="on"/>
+        </w:trPr>
+        <w:tc>
+          <w:tcPr/>
+          <w:p>
+            <w:pPr>
+              <w:pStyle w:val="Compact"/>
+              <w:jc w:val="left"/>
+            </w:pPr>
+            <w:r>
+              <w:t xml:space="preserve">Published model</w:t>
+            </w:r>
+          </w:p>
+        </w:tc>
+        <w:tc>
+          <w:tcPr/>
+          <w:p>
+            <w:pPr>
+              <w:pStyle w:val="Compact"/>
+              <w:jc w:val="right"/>
+            </w:pPr>
+            <w:r>
+              <w:t xml:space="preserve">Success</w:t>
+            </w:r>
+          </w:p>
+        </w:tc>
+        <w:tc>
+          <w:tcPr/>
+          <w:p>
+            <w:pPr>
+              <w:pStyle w:val="Compact"/>
+              <w:jc w:val="right"/>
+            </w:pPr>
+            <w:r>
+              <w:t xml:space="preserve">Estimated inference USD/task</w:t>
+            </w:r>
+          </w:p>
+        </w:tc>
+        <w:tc>
+          <w:tcPr/>
+          <w:p>
+            <w:pPr>
+              <w:pStyle w:val="Compact"/>
+              <w:jc w:val="right"/>
+            </w:pPr>
+            <w:r>
+              <w:t xml:space="preserve">USD/resolved task</w:t>
+            </w:r>
+          </w:p>
+        </w:tc>
+      </w:tr>
+      <w:tr>
+        <w:tc>
+          <w:tcPr/>
+          <w:p>
+            <w:pPr>
+              <w:pStyle w:val="Compact"/>
+              <w:jc w:val="left"/>
+            </w:pPr>
+            <w:r>
+              <w:t xml:space="preserve">GPT-5-mini</w:t>
+            </w:r>
+          </w:p>
+        </w:tc>
+        <w:tc>
+          <w:tcPr/>
+          <w:p>
+            <w:pPr>
+              <w:pStyle w:val="Compact"/>
+              <w:jc w:val="right"/>
+            </w:pPr>
+            <w:r>
+              <w:t xml:space="preserve">56.2%</w:t>
+            </w:r>
+          </w:p>
+        </w:tc>
+        <w:tc>
+          <w:tcPr/>
+          <w:p>
+            <w:pPr>
+              <w:pStyle w:val="Compact"/>
+              <w:jc w:val="right"/>
+            </w:pPr>
+            <w:r>
+              <w:t xml:space="preserve">0.0472</w:t>
+            </w:r>
+          </w:p>
+        </w:tc>
+        <w:tc>
+          <w:tcPr/>
+          <w:p>
+            <w:pPr>
+              <w:pStyle w:val="Compact"/>
+              <w:jc w:val="right"/>
+            </w:pPr>
+            <w:r>
+              <w:t xml:space="preserve">0.0840</w:t>
+            </w:r>
+          </w:p>
+        </w:tc>
+      </w:tr>
+      <w:tr>
+        <w:tc>
+          <w:tcPr/>
+          <w:p>
+            <w:pPr>
+              <w:pStyle w:val="Compact"/>
+              <w:jc w:val="left"/>
+            </w:pPr>
+            <w:r>
+              <w:t xml:space="preserve">GPT-5.2, high</w:t>
+            </w:r>
+          </w:p>
+        </w:tc>
+        <w:tc>
+          <w:tcPr/>
+          <w:p>
+            <w:pPr>
+              <w:pStyle w:val="Compact"/>
+              <w:jc w:val="right"/>
+            </w:pPr>
+            <w:r>
+              <w:t xml:space="preserve">72.8%</w:t>
+            </w:r>
+          </w:p>
+        </w:tc>
+        <w:tc>
+          <w:tcPr/>
+          <w:p>
+            <w:pPr>
+              <w:pStyle w:val="Compact"/>
+              <w:jc w:val="right"/>
+            </w:pPr>
+            <w:r>
+              <w:t xml:space="preserve">0.4736</w:t>
+            </w:r>
+          </w:p>
+        </w:tc>
+        <w:tc>
+          <w:tcPr/>
+          <w:p>
+            <w:pPr>
+              <w:pStyle w:val="Compact"/>
+              <w:jc w:val="right"/>
+            </w:pPr>
+            <w:r>
+              <w:t xml:space="preserve">0.6505</w:t>
+            </w:r>
+          </w:p>
+        </w:tc>
+      </w:tr>
+      <w:tr>
+        <w:tc>
+          <w:tcPr/>
+          <w:p>
+            <w:pPr>
+              <w:pStyle w:val="Compact"/>
+              <w:jc w:val="left"/>
+            </w:pPr>
+            <w:r>
+              <w:t xml:space="preserve">DeepSeek-V3.2, high</w:t>
+            </w:r>
+          </w:p>
+        </w:tc>
+        <w:tc>
+          <w:tcPr/>
+          <w:p>
+            <w:pPr>
+              <w:pStyle w:val="Compact"/>
+              <w:jc w:val="right"/>
+            </w:pPr>
+            <w:r>
+              <w:t xml:space="preserve">70.0%</w:t>
+            </w:r>
+          </w:p>
+        </w:tc>
+        <w:tc>
+          <w:tcPr/>
+          <w:p>
+            <w:pPr>
+              <w:pStyle w:val="Compact"/>
+              <w:jc w:val="right"/>
+            </w:pPr>
+            <w:r>
+              <w:t xml:space="preserve">0.4478</w:t>
+            </w:r>
+          </w:p>
+        </w:tc>
+        <w:tc>
+          <w:tcPr/>
+          <w:p>
+            <w:pPr>
+              <w:pStyle w:val="Compact"/>
+              <w:jc w:val="right"/>
+            </w:pPr>
+            <w:r>
+              <w:t xml:space="preserve">0.6398</w:t>
+            </w:r>
+          </w:p>
+        </w:tc>
+      </w:tr>
+      <w:tr>
+        <w:tc>
+          <w:tcPr/>
+          <w:p>
+            <w:pPr>
+              <w:pStyle w:val="Compact"/>
+              <w:jc w:val="left"/>
+            </w:pPr>
+            <w:r>
+              <w:t xml:space="preserve">Kimi-K2.5, high</w:t>
+            </w:r>
+          </w:p>
+        </w:tc>
+        <w:tc>
+          <w:tcPr/>
+          <w:p>
+            <w:pPr>
+              <w:pStyle w:val="Compact"/>
+              <w:jc w:val="right"/>
+            </w:pPr>
+            <w:r>
+              <w:t xml:space="preserve">70.8%</w:t>
+            </w:r>
+          </w:p>
+        </w:tc>
+        <w:tc>
+          <w:tcPr/>
+          <w:p>
+            <w:pPr>
+              <w:pStyle w:val="Compact"/>
+              <w:jc w:val="right"/>
+            </w:pPr>
+            <w:r>
+              <w:t xml:space="preserve">0.1466</w:t>
+            </w:r>
+          </w:p>
+        </w:tc>
+        <w:tc>
+          <w:tcPr/>
+          <w:p>
+            <w:pPr>
+              <w:pStyle w:val="Compact"/>
+              <w:jc w:val="right"/>
+            </w:pPr>
+            <w:r>
+              <w:t xml:space="preserve">0.2070</w:t>
+            </w:r>
+          </w:p>
+        </w:tc>
+      </w:tr>
+      <w:tr>
+        <w:tc>
+          <w:tcPr/>
+          <w:p>
+            <w:pPr>
+              <w:pStyle w:val="Compact"/>
+              <w:jc w:val="left"/>
+            </w:pPr>
+            <w:r>
+              <w:t xml:space="preserve">MiniMax-M2.5, high</w:t>
+            </w:r>
+          </w:p>
+        </w:tc>
+        <w:tc>
+          <w:tcPr/>
+          <w:p>
+            <w:pPr>
+              <w:pStyle w:val="Compact"/>
+              <w:jc w:val="right"/>
+            </w:pPr>
+            <w:r>
+              <w:t xml:space="preserve">75.8%</w:t>
+            </w:r>
+          </w:p>
+        </w:tc>
+        <w:tc>
+          <w:tcPr/>
+          <w:p>
+            <w:pPr>
+              <w:pStyle w:val="Compact"/>
+              <w:jc w:val="right"/>
+            </w:pPr>
+            <w:r>
+              <w:t xml:space="preserve">0.0733</w:t>
+            </w:r>
+          </w:p>
+        </w:tc>
+        <w:tc>
+          <w:tcPr/>
+          <w:p>
+            <w:pPr>
+              <w:pStyle w:val="Compact"/>
+              <w:jc w:val="right"/>
+            </w:pPr>
+            <w:r>
+              <w:t xml:space="preserve">0.0967</w:t>
+            </w:r>
+          </w:p>
+        </w:tc>
+      </w:tr>
+      <w:tr>
+        <w:tc>
+          <w:tcPr/>
+          <w:p>
+            <w:pPr>
+              <w:pStyle w:val="Compact"/>
+              <w:jc w:val="left"/>
+            </w:pPr>
+            <w:r>
+              <w:t xml:space="preserve">GLM-5, high</w:t>
+            </w:r>
+          </w:p>
+        </w:tc>
+        <w:tc>
+          <w:tcPr/>
+          <w:p>
+            <w:pPr>
+              <w:pStyle w:val="Compact"/>
+              <w:jc w:val="right"/>
+            </w:pPr>
+            <w:r>
+              <w:t xml:space="preserve">72.8%</w:t>
+            </w:r>
+          </w:p>
+        </w:tc>
+        <w:tc>
+          <w:tcPr/>
+          <w:p>
+            <w:pPr>
+              <w:pStyle w:val="Compact"/>
+              <w:jc w:val="right"/>
+            </w:pPr>
+            <w:r>
+              <w:t xml:space="preserve">0.5344</w:t>
+            </w:r>
+          </w:p>
+        </w:tc>
+        <w:tc>
+          <w:tcPr/>
+          <w:p>
+            <w:pPr>
+              <w:pStyle w:val="Compact"/>
+              <w:jc w:val="right"/>
+            </w:pPr>
+            <w:r>
+              <w:t xml:space="preserve">0.7341</w:t>
+            </w:r>
+          </w:p>
+        </w:tc>
+      </w:tr>
+      <w:tr>
+        <w:tc>
+          <w:tcPr/>
+          <w:p>
+            <w:pPr>
+              <w:pStyle w:val="Compact"/>
+              <w:jc w:val="left"/>
+            </w:pPr>
+            <w:r>
+              <w:t xml:space="preserve">Gemini-3-Flash, high</w:t>
+            </w:r>
+          </w:p>
+        </w:tc>
+        <w:tc>
+          <w:tcPr/>
+          <w:p>
+            <w:pPr>
+              <w:pStyle w:val="Compact"/>
+              <w:jc w:val="right"/>
+            </w:pPr>
+            <w:r>
+              <w:t xml:space="preserve">75.8%</w:t>
+            </w:r>
+          </w:p>
+        </w:tc>
+        <w:tc>
+          <w:tcPr/>
+          <w:p>
+            <w:pPr>
+              <w:pStyle w:val="Compact"/>
+              <w:jc w:val="right"/>
+            </w:pPr>
+            <w:r>
+              <w:t xml:space="preserve">0.3560</w:t>
+            </w:r>
+          </w:p>
+        </w:tc>
+        <w:tc>
+          <w:tcPr/>
+          <w:p>
+            <w:pPr>
+              <w:pStyle w:val="Compact"/>
+              <w:jc w:val="right"/>
+            </w:pPr>
+            <w:r>
+              <w:t xml:space="preserve">0.4696</w:t>
+            </w:r>
+          </w:p>
+        </w:tc>
+      </w:tr>
+      <w:tr>
+        <w:tc>
+          <w:tcPr/>
+          <w:p>
+            <w:pPr>
+              <w:pStyle w:val="Compact"/>
+              <w:jc w:val="left"/>
+            </w:pPr>
+            <w:r>
+              <w:t xml:space="preserve">Claude-Haiku-4.5, high</w:t>
+            </w:r>
+          </w:p>
+        </w:tc>
+        <w:tc>
+          <w:tcPr/>
+          <w:p>
+            <w:pPr>
+              <w:pStyle w:val="Compact"/>
+              <w:jc w:val="right"/>
+            </w:pPr>
+            <w:r>
+              <w:t xml:space="preserve">66.6%</w:t>
+            </w:r>
+          </w:p>
+        </w:tc>
+        <w:tc>
+          <w:tcPr/>
+          <w:p>
+            <w:pPr>
+              <w:pStyle w:val="Compact"/>
+              <w:jc w:val="right"/>
+            </w:pPr>
+            <w:r>
+              <w:t xml:space="preserve">0.3309</w:t>
+            </w:r>
+          </w:p>
+        </w:tc>
+        <w:tc>
+          <w:tcPr/>
+          <w:p>
+            <w:pPr>
+              <w:pStyle w:val="Compact"/>
+              <w:jc w:val="right"/>
+            </w:pPr>
+            <w:r>
+              <w:t xml:space="preserve">0.4969</w:t>
+            </w:r>
+          </w:p>
+        </w:tc>
+      </w:tr>
+      <w:tr>
+        <w:tc>
+          <w:tcPr/>
+          <w:p>
+            <w:pPr>
+              <w:pStyle w:val="Compact"/>
+              <w:jc w:val="left"/>
+            </w:pPr>
+            <w:r>
+              <w:t xml:space="preserve">Claude-Sonnet-4.5, high</w:t>
+            </w:r>
+          </w:p>
+        </w:tc>
+        <w:tc>
+          <w:tcPr/>
+          <w:p>
+            <w:pPr>
+              <w:pStyle w:val="Compact"/>
+              <w:jc w:val="right"/>
+            </w:pPr>
+            <w:r>
+              <w:t xml:space="preserve">71.4%</w:t>
+            </w:r>
+          </w:p>
+        </w:tc>
+        <w:tc>
+          <w:tcPr/>
+          <w:p>
+            <w:pPr>
+              <w:pStyle w:val="Compact"/>
+              <w:jc w:val="right"/>
+            </w:pPr>
+            <w:r>
+              <w:t xml:space="preserve">0.6579</w:t>
+            </w:r>
+          </w:p>
+        </w:tc>
+        <w:tc>
+          <w:tcPr/>
+          <w:p>
+            <w:pPr>
+              <w:pStyle w:val="Compact"/>
+              <w:jc w:val="right"/>
+            </w:pPr>
+            <w:r>
+              <w:t xml:space="preserve">0.9214</w:t>
+            </w:r>
+          </w:p>
+        </w:tc>
+      </w:tr>
+      <w:tr>
+        <w:tc>
+          <w:tcPr/>
+          <w:p>
+            <w:pPr>
+              <w:pStyle w:val="Compact"/>
+              <w:jc w:val="left"/>
+            </w:pPr>
+            <w:r>
+              <w:t xml:space="preserve">Claude-Opus-4.6</w:t>
+            </w:r>
+          </w:p>
+        </w:tc>
+        <w:tc>
+          <w:tcPr/>
+          <w:p>
+            <w:pPr>
+              <w:pStyle w:val="Compact"/>
+              <w:jc w:val="right"/>
+            </w:pPr>
+            <w:r>
+              <w:t xml:space="preserve">75.6%</w:t>
+            </w:r>
+          </w:p>
+        </w:tc>
+        <w:tc>
+          <w:tcPr/>
+          <w:p>
+            <w:pPr>
+              <w:pStyle w:val="Compact"/>
+              <w:jc w:val="right"/>
+            </w:pPr>
+            <w:r>
+              <w:t xml:space="preserve">0.5515</w:t>
+            </w:r>
+          </w:p>
+        </w:tc>
+        <w:tc>
+          <w:tcPr/>
+          <w:p>
+            <w:pPr>
+              <w:pStyle w:val="Compact"/>
+              <w:jc w:val="right"/>
+            </w:pPr>
+            <w:r>
+              <w:t xml:space="preserve">0.7295</w:t>
+            </w:r>
+          </w:p>
+        </w:tc>
+      </w:tr>
+    </w:tbl>
+    <w:p>
+      <w:pPr>
+        <w:pStyle w:val="BodyText"/>
+      </w:pPr>
+      <w:r>
+        <w:t xml:space="preserve">MiniMax-M2.5 alone resolves</w:t>
+      </w:r>
+      <w:r>
+        <w:t xml:space="preserve"> </w:t>
+      </w:r>
+      <w:r>
+        <w:rPr>
+          <w:b/>
+          <w:bCs/>
+        </w:rPr>
+        <w:t xml:space="preserve">379/500</w:t>
+      </w:r>
+      <w:r>
+        <w:t xml:space="preserve"> </w:t>
+      </w:r>
+      <w:r>
+        <w:t xml:space="preserve">at</w:t>
+      </w:r>
+      <w:r>
+        <w:t xml:space="preserve"> </w:t>
+      </w:r>
+      <w:r>
+        <w:rPr>
+          <w:b/>
+          <w:bCs/>
+        </w:rPr>
+        <w:t xml:space="preserve">US$0.0733 per assigned task</w:t>
+      </w:r>
+      <w:r>
+        <w:t xml:space="preserve">. Its</w:t>
+      </w:r>
+      <w:r>
+        <w:t xml:space="preserve"> </w:t>
+      </w:r>
+      <w:r>
+        <w:t xml:space="preserve">historical estimated inference cost is 84.5% below the GPT-5.2 reference, with</w:t>
+      </w:r>
+      <w:r>
+        <w:t xml:space="preserve"> </w:t>
+      </w:r>
+      <w:r>
+        <w:t xml:space="preserve">a three-point higher observed success rate. This is evidence about</w:t>
+      </w:r>
+      <w:r>
+        <w:t xml:space="preserve"> </w:t>
+      </w:r>
+      <w:r>
+        <w:rPr>
+          <w:b/>
+          <w:bCs/>
+        </w:rPr>
+        <w:t xml:space="preserve">model</w:t>
+      </w:r>
+      <w:r>
+        <w:rPr>
+          <w:b/>
+          <w:bCs/>
+        </w:rPr>
+        <w:t xml:space="preserve"> </w:t>
+      </w:r>
+      <w:r>
+        <w:rPr>
+          <w:b/>
+          <w:bCs/>
+        </w:rPr>
+        <w:t xml:space="preserve">choice in the archived comparison</w:t>
+      </w:r>
+      <w:r>
+        <w:t xml:space="preserve">, not a routing effect and not a local-small-</w:t>
+      </w:r>
+      <w:r>
+        <w:t xml:space="preserve"> </w:t>
+      </w:r>
+      <w:r>
+        <w:t xml:space="preserve">model result. Model size cannot be inferred from price or the word</w:t>
+      </w:r>
+      <w:r>
+        <w:t xml:space="preserve"> </w:t>
+      </w:r>
+      <w:r>
+        <w:t xml:space="preserve">“</w:t>
+      </w:r>
+      <w:r>
+        <w:t xml:space="preserve">mini</w:t>
+      </w:r>
+      <w:r>
+        <w:t xml:space="preserve">”</w:t>
+      </w:r>
+      <w:r>
+        <w:t xml:space="preserve">.</w:t>
+      </w:r>
+    </w:p>
+    <w:p>
+      <w:pPr>
+        <w:pStyle w:val="BodyText"/>
+      </w:pPr>
+      <w:r>
+        <w:t xml:space="preserve">For illustration within the prespecified exploratory grid, the ten-model</w:t>
+      </w:r>
+      <w:r>
+        <w:t xml:space="preserve"> </w:t>
+      </w:r>
+      <w:r>
+        <w:t xml:space="preserve">utility policy at coefficient 0.25 resolves</w:t>
+      </w:r>
+      <w:r>
+        <w:t xml:space="preserve"> </w:t>
+      </w:r>
+      <w:r>
+        <w:rPr>
+          <w:b/>
+          <w:bCs/>
+        </w:rPr>
+        <w:t xml:space="preserve">381/500 (76.2%)</w:t>
+      </w:r>
+      <w:r>
+        <w:t xml:space="preserve"> </w:t>
+      </w:r>
+      <w:r>
+        <w:t xml:space="preserve">at</w:t>
+      </w:r>
+      <w:r>
+        <w:t xml:space="preserve"> </w:t>
+      </w:r>
+      <w:r>
+        <w:rPr>
+          <w:b/>
+          <w:bCs/>
+        </w:rPr>
+        <w:t xml:space="preserve">US$0.1154 per</w:t>
+      </w:r>
+      <w:r>
+        <w:rPr>
+          <w:b/>
+          <w:bCs/>
+        </w:rPr>
+        <w:t xml:space="preserve"> </w:t>
+      </w:r>
+      <w:r>
+        <w:rPr>
+          <w:b/>
+          <w:bCs/>
+        </w:rPr>
+        <w:t xml:space="preserve">task</w:t>
+      </w:r>
+      <w:r>
+        <w:t xml:space="preserve">. Compared with GPT-5.2, that appears attractive: 75.6% lower estimated</w:t>
+      </w:r>
+      <w:r>
+        <w:t xml:space="preserve"> </w:t>
+      </w:r>
+      <w:r>
+        <w:t xml:space="preserve">inference cost and 3.4 points more success. Compared with MiniMax alone, however,</w:t>
+      </w:r>
+      <w:r>
+        <w:t xml:space="preserve"> </w:t>
+      </w:r>
+      <w:r>
+        <w:t xml:space="preserve">it adds only two resolved issues while costing approximately</w:t>
+      </w:r>
+      <w:r>
+        <w:t xml:space="preserve"> </w:t>
+      </w:r>
+      <w:r>
+        <w:rPr>
+          <w:b/>
+          <w:bCs/>
+        </w:rPr>
+        <w:t xml:space="preserve">57.4% more</w:t>
+      </w:r>
+      <w:r>
+        <w:t xml:space="preserve">.</w:t>
+      </w:r>
+      <w:r>
+        <w:t xml:space="preserve"> </w:t>
+      </w:r>
+      <w:r>
+        <w:t xml:space="preserve">The quality-difference interval is −0.8 to +1.6 points, while the cost-ratio</w:t>
+      </w:r>
+      <w:r>
+        <w:t xml:space="preserve"> </w:t>
+      </w:r>
+      <w:r>
+        <w:t xml:space="preserve">interval is 1.398 to 1.762. These additional paired comparisons are explicitly</w:t>
+      </w:r>
+      <w:r>
+        <w:t xml:space="preserve"> </w:t>
+      </w:r>
+      <w:r>
+        <w:t xml:space="preserve">labelled exploratory and conditional on the fitted policies.</w:t>
+      </w:r>
+      <w:r>
+        <w:t xml:space="preserve"> </w:t>
+      </w:r>
+      <w:r>
+        <w:t xml:space="preserve">This operating point is not declared a winner after searching the grid. The</w:t>
+      </w:r>
+      <w:r>
+        <w:t xml:space="preserve"> </w:t>
+      </w:r>
+      <w:r>
+        <w:t xml:space="preserve">whole grid and comparisons with the inexpensive standalone model are retained.</w:t>
+      </w:r>
+      <w:r>
+        <w:t xml:space="preserve"> </w:t>
+      </w:r>
+      <w:r>
+        <w:t xml:space="preserve">Attributing all of the difference versus an expensive reference to intelligent</w:t>
+      </w:r>
+      <w:r>
+        <w:t xml:space="preserve"> </w:t>
+      </w:r>
+      <w:r>
+        <w:t xml:space="preserve">routing would be misleading.</w:t>
+      </w:r>
+    </w:p>
+    <w:p>
+      <w:pPr>
+        <w:pStyle w:val="BodyText"/>
+      </w:pPr>
+      <w:r>
+        <w:t xml:space="preserve">The recorded ten-model oracle resolves 87.8%, while the two-model oracle</w:t>
+      </w:r>
+      <w:r>
+        <w:t xml:space="preserve"> </w:t>
+      </w:r>
+      <w:r>
+        <w:t xml:space="preserve">resolves 76.6%. These bounds suggest potential complementarity, but the oracles</w:t>
+      </w:r>
+      <w:r>
+        <w:t xml:space="preserve"> </w:t>
+      </w:r>
+      <w:r>
+        <w:t xml:space="preserve">use the answers and realized costs. They do not demonstrate that an available</w:t>
+      </w:r>
+      <w:r>
+        <w:t xml:space="preserve"> </w:t>
+      </w:r>
+      <w:r>
+        <w:t xml:space="preserve">router, personal agent or conversation policy can achieve those figures.</w:t>
+      </w:r>
+    </w:p>
+    <w:p>
+      <w:pPr>
+        <w:pStyle w:val="CaptionedFigure"/>
+      </w:pPr>
+      <w:r>
+        <w:drawing>
+          <wp:inline>
+            <wp:extent cx="5334000" cy="3733800"/>
+            <wp:effectExtent b="0" l="0" r="0" t="0"/>
+            <wp:docPr descr="Historical SWE-bench Verified cost–quality operating points with standalone controls. Router points replay held-out model selections; the oracle uses unavailable test outcomes. Costs omit unobserved deployment expenses." title="" id="57" name="Picture"/>
+            <a:graphic>
+              <a:graphicData uri="http://schemas.openxmlformats.org/drawingml/2006/picture">
+                <pic:pic>
+                  <pic:nvPicPr>
+                    <pic:cNvPr descr="../../results/swe-replay-001/figures/standalone-controls.png" id="58" name="Picture"/>
+                    <pic:cNvPicPr>
+                      <a:picLocks noChangeArrowheads="1" noChangeAspect="1"/>
+                    </pic:cNvPicPr>
+                  </pic:nvPicPr>
+                  <pic:blipFill>
+                    <a:blip r:embed="rId56"/>
+                    <a:stretch>
+                      <a:fillRect/>
+                    </a:stretch>
+                  </pic:blipFill>
+                  <pic:spPr bwMode="auto">
+                    <a:xfrm>
+                      <a:off x="0" y="0"/>
+                      <a:ext cx="5334000" cy="3733800"/>
+                    </a:xfrm>
+                    <a:prstGeom prst="rect">
+                      <a:avLst/>
+                    </a:prstGeom>
+                    <a:noFill/>
+                    <a:ln w="9525">
+                      <a:noFill/>
+                      <a:headEnd/>
+                      <a:tailEnd/>
+                    </a:ln>
+                  </pic:spPr>
+                </pic:pic>
+              </a:graphicData>
+            </a:graphic>
+          </wp:inline>
+        </w:drawing>
+      </w:r>
+    </w:p>
+    <w:p>
+      <w:pPr>
+        <w:pStyle w:val="ImageCaption"/>
+      </w:pPr>
+      <w:r>
+        <w:t xml:space="preserve">Historical SWE-bench Verified cost–quality operating points with standalone controls. Router points replay held-out model selections; the oracle uses unavailable test outcomes. Costs omit unobserved deployment expenses.</w:t>
+      </w:r>
+    </w:p>
+    <w:bookmarkEnd w:id="59"/>
+    <w:bookmarkStart w:id="60" w:name="statistical-and-economic-limits"/>
+    <w:p>
+      <w:pPr>
+        <w:pStyle w:val="Heading2"/>
+      </w:pPr>
+      <w:r>
+        <w:rPr>
+          <w:rStyle w:val="SectionNumber"/>
+        </w:rPr>
+        <w:t xml:space="preserve">7.5</w:t>
+      </w:r>
+      <w:r>
+        <w:tab/>
+      </w:r>
+      <w:r>
+        <w:t xml:space="preserve">Statistical and economic limits</w:t>
+      </w:r>
+    </w:p>
+    <w:p>
+      <w:pPr>
+        <w:pStyle w:val="FirstParagraph"/>
+      </w:pPr>
+      <w:r>
+        <w:t xml:space="preserve">Intervals use 2,000 paired resamples and condition on the fitted cross-fold</w:t>
+      </w:r>
+      <w:r>
+        <w:t xml:space="preserve"> </w:t>
+      </w:r>
+      <w:r>
+        <w:t xml:space="preserve">policies and the recorded outcomes; they do not refit the router inside every</w:t>
+      </w:r>
+      <w:r>
+        <w:t xml:space="preserve"> </w:t>
+      </w:r>
+      <w:r>
+        <w:t xml:space="preserve">bootstrap sample. A repository-cluster sensitivity analysis uses only twelve</w:t>
+      </w:r>
+      <w:r>
+        <w:t xml:space="preserve"> </w:t>
+      </w:r>
+      <w:r>
+        <w:t xml:space="preserve">clusters. Training and test folds can share repositories, so repository-unseen</w:t>
+      </w:r>
+      <w:r>
+        <w:t xml:space="preserve"> </w:t>
+      </w:r>
+      <w:r>
+        <w:t xml:space="preserve">generalization is not established. One recorded attempt per model and task</w:t>
+      </w:r>
+      <w:r>
+        <w:t xml:space="preserve"> </w:t>
+      </w:r>
+      <w:r>
+        <w:t xml:space="preserve">cannot estimate repeated-inference variance. Grid comparisons are exploratory</w:t>
+      </w:r>
+      <w:r>
+        <w:t xml:space="preserve"> </w:t>
+      </w:r>
+      <w:r>
+        <w:t xml:space="preserve">and do not support a familywise claim from choosing their best point.</w:t>
+      </w:r>
+    </w:p>
+    <w:p>
+      <w:pPr>
+        <w:pStyle w:val="BodyText"/>
+      </w:pPr>
+      <w:r>
+        <w:t xml:space="preserve">Upstream numerical costs are preserved rather than replaced by current prices.</w:t>
+      </w:r>
+      <w:r>
+        <w:t xml:space="preserve"> </w:t>
+      </w:r>
+      <w:r>
+        <w:t xml:space="preserve">They are not independently audited invoices. Two unresolved Gemini entries</w:t>
+      </w:r>
+      <w:r>
+        <w:t xml:space="preserve"> </w:t>
+      </w:r>
+      <w:r>
+        <w:t xml:space="preserve">report zero cost despite one API call each; these values are not proof of free</w:t>
+      </w:r>
+      <w:r>
+        <w:t xml:space="preserve"> </w:t>
+      </w:r>
+      <w:r>
+        <w:t xml:space="preserve">inference. Neither the primary policy nor the illustrated portfolio selects</w:t>
+      </w:r>
+      <w:r>
+        <w:t xml:space="preserve"> </w:t>
+      </w:r>
+      <w:r>
+        <w:t xml:space="preserve">those entries. Their effect on other policies is recorded in the supplementary</w:t>
+      </w:r>
+      <w:r>
+        <w:t xml:space="preserve"> </w:t>
+      </w:r>
+      <w:r>
+        <w:t xml:space="preserve">cost-source checks. Router fitting took roughly two CPU seconds in</w:t>
+      </w:r>
+      <w:r>
+        <w:t xml:space="preserve"> </w:t>
+      </w:r>
+      <w:r>
+        <w:t xml:space="preserve">this run, but no electricity, machine allocation or test-execution dollar rate</w:t>
+      </w:r>
+      <w:r>
+        <w:t xml:space="preserve"> </w:t>
+      </w:r>
+      <w:r>
+        <w:t xml:space="preserve">was measured. Total operational cost and Codex subscription-credit savings</w:t>
+      </w:r>
+      <w:r>
+        <w:t xml:space="preserve"> </w:t>
+      </w:r>
+      <w:r>
+        <w:t xml:space="preserve">remain unknown. No new model-inference purchase was needed for this replay.</w:t>
+      </w:r>
+    </w:p>
+    <w:p>
+      <w:pPr>
+        <w:pStyle w:val="BodyText"/>
+      </w:pPr>
+      <w:r>
+        <w:t xml:space="preserve">The implications for the conversational study are concrete. First, retain a</w:t>
+      </w:r>
+      <w:r>
+        <w:t xml:space="preserve"> </w:t>
+      </w:r>
+      <w:r>
+        <w:t xml:space="preserve">strong low-cost standalone model in the comparison. Second, ask whether runtime</w:t>
+      </w:r>
+      <w:r>
+        <w:t xml:space="preserve"> </w:t>
+      </w:r>
+      <w:r>
+        <w:t xml:space="preserve">evidence and conversation improve the weak pre-task selection result. Third,</w:t>
+      </w:r>
+      <w:r>
+        <w:t xml:space="preserve"> </w:t>
+      </w:r>
+      <w:r>
+        <w:t xml:space="preserve">measure all controller, expert, verification and failed-attempt usage before</w:t>
+      </w:r>
+      <w:r>
+        <w:t xml:space="preserve"> </w:t>
+      </w:r>
+      <w:r>
+        <w:t xml:space="preserve">claiming savings. The replay supplies a reproducible benchmark finding and</w:t>
+      </w:r>
+      <w:r>
+        <w:t xml:space="preserve"> </w:t>
+      </w:r>
+      <w:r>
+        <w:t xml:space="preserve">better controls; the causal bidirectional-conversation experiment still needs</w:t>
+      </w:r>
+      <w:r>
+        <w:t xml:space="preserve"> </w:t>
+      </w:r>
+      <w:r>
+        <w:t xml:space="preserve">fresh metered execution.</w:t>
+      </w:r>
+    </w:p>
+    <w:bookmarkEnd w:id="60"/>
+    <w:bookmarkEnd w:id="61"/>
+    <w:bookmarkStart w:id="62" w:name="discussion-and-limits"/>
+    <w:p>
+      <w:pPr>
+        <w:pStyle w:val="Heading1"/>
+      </w:pPr>
+      <w:r>
+        <w:rPr>
+          <w:rStyle w:val="SectionNumber"/>
+        </w:rPr>
+        <w:t xml:space="preserve">8</w:t>
+      </w:r>
+      <w:r>
+        <w:tab/>
+      </w:r>
+      <w:r>
+        <w:t xml:space="preserve">Discussion and limits</w:t>
+      </w:r>
+    </w:p>
+    <w:p>
+      <w:pPr>
+        <w:pStyle w:val="FirstParagraph"/>
+      </w:pPr>
+      <w:r>
+        <w:t xml:space="preserve">The literature makes the central hypothesis plausible without making it new or</w:t>
+      </w:r>
+      <w:r>
+        <w:t xml:space="preserve"> </w:t>
+      </w:r>
+      <w:r>
+        <w:t xml:space="preserve">settled. EdgeWise reports substantial cloud-API savings with small changes in</w:t>
+      </w:r>
+      <w:r>
+        <w:t xml:space="preserve"> </w:t>
+      </w:r>
+      <w:r>
+        <w:t xml:space="preserve">software-task performance under particular conditions, but its accounting</w:t>
+      </w:r>
+      <w:r>
+        <w:t xml:space="preserve"> </w:t>
+      </w:r>
+      <w:r>
+        <w:t xml:space="preserve">excludes the local SLM. Router-R1 and related work already make the router an</w:t>
+      </w:r>
+      <w:r>
+        <w:t xml:space="preserve"> </w:t>
+      </w:r>
+      <w:r>
+        <w:t xml:space="preserve">active participant that reasons across model responses. The present study must</w:t>
+      </w:r>
+      <w:r>
+        <w:t xml:space="preserve"> </w:t>
+      </w:r>
+      <w:r>
+        <w:t xml:space="preserve">therefore establish its value through reproducible comparisons, complete cost</w:t>
+      </w:r>
+      <w:r>
+        <w:t xml:space="preserve"> </w:t>
+      </w:r>
+      <w:r>
+        <w:t xml:space="preserve">measurement and a precise intervention, rather than the assertion that models</w:t>
+      </w:r>
+      <w:r>
+        <w:t xml:space="preserve"> </w:t>
+      </w:r>
+      <w:r>
+        <w:t xml:space="preserve">have never conversed before.</w:t>
+      </w:r>
+    </w:p>
+    <w:p>
+      <w:pPr>
+        <w:pStyle w:val="BodyText"/>
+      </w:pPr>
+      <w:r>
+        <w:t xml:space="preserve">The proposed distinction is continuing expert dialogue: an expert can ask for</w:t>
+      </w:r>
+      <w:r>
+        <w:t xml:space="preserve"> </w:t>
+      </w:r>
+      <w:r>
+        <w:t xml:space="preserve">missing evidence, challenge an interpretation and revise a proposal while the</w:t>
+      </w:r>
+      <w:r>
+        <w:t xml:space="preserve"> </w:t>
+      </w:r>
+      <w:r>
+        <w:t xml:space="preserve">small controller continues working. That may prevent context omissions and</w:t>
+      </w:r>
+      <w:r>
+        <w:t xml:space="preserve"> </w:t>
+      </w:r>
+      <w:r>
+        <w:t xml:space="preserve">uncritical acceptance. It may also waste time, encourage circular conversation</w:t>
+      </w:r>
+      <w:r>
+        <w:t xml:space="preserve"> </w:t>
+      </w:r>
+      <w:r>
+        <w:t xml:space="preserve">or amplify a shared mistake. Compare it directly with one-way assistance and</w:t>
+      </w:r>
+      <w:r>
+        <w:t xml:space="preserve"> </w:t>
+      </w:r>
+      <w:r>
+        <w:t xml:space="preserve">reset expert sessions under equal budgets. A bidirectional API alone is not a</w:t>
+      </w:r>
+      <w:r>
+        <w:t xml:space="preserve"> </w:t>
+      </w:r>
+      <w:r>
+        <w:t xml:space="preserve">scientific contribution; the empirical finding, including a negative result,</w:t>
+      </w:r>
+      <w:r>
+        <w:t xml:space="preserve"> </w:t>
+      </w:r>
+      <w:r>
+        <w:t xml:space="preserve">is the contribution.</w:t>
+      </w:r>
+    </w:p>
+    <w:p>
+      <w:pPr>
+        <w:pStyle w:val="BodyText"/>
+      </w:pPr>
+      <w:r>
+        <w:t xml:space="preserve">The complete SWE-bench Verified replay sharpens this requirement. The primary</w:t>
+      </w:r>
+      <w:r>
+        <w:t xml:space="preserve"> </w:t>
+      </w:r>
+      <w:r>
+        <w:t xml:space="preserve">pre-task router saves estimated inference dollars but loses too much quality,</w:t>
+      </w:r>
+      <w:r>
+        <w:t xml:space="preserve"> </w:t>
+      </w:r>
+      <w:r>
+        <w:t xml:space="preserve">and a strong inexpensive standalone model undercuts the apparent advantage of</w:t>
+      </w:r>
+      <w:r>
+        <w:t xml:space="preserve"> </w:t>
+      </w:r>
+      <w:r>
+        <w:t xml:space="preserve">several portfolio operating points. A conversational agent must therefore beat</w:t>
+      </w:r>
+      <w:r>
+        <w:t xml:space="preserve"> </w:t>
+      </w:r>
+      <w:r>
+        <w:t xml:space="preserve">credible cheap standalone alternatives, not merely reduce calls to a costly</w:t>
+      </w:r>
+      <w:r>
+        <w:t xml:space="preserve"> </w:t>
+      </w:r>
+      <w:r>
+        <w:t xml:space="preserve">reference. The replay is a standard-benchmark result, while its historical</w:t>
+      </w:r>
+      <w:r>
+        <w:t xml:space="preserve"> </w:t>
+      </w:r>
+      <w:r>
+        <w:t xml:space="preserve">single-attempt data and unmeasured deployment expenses restrict its claims.</w:t>
+      </w:r>
+    </w:p>
+    <w:p>
+      <w:pPr>
+        <w:pStyle w:val="BodyText"/>
+      </w:pPr>
+      <w:r>
+        <w:t xml:space="preserve">The pilot’s lack of optional consultations is a useful design lesson. Easy</w:t>
+      </w:r>
+      <w:r>
+        <w:t xml:space="preserve"> </w:t>
+      </w:r>
+      <w:r>
+        <w:t xml:space="preserve">tasks can show that a controller avoids unnecessary expert work, but cannot</w:t>
+      </w:r>
+      <w:r>
+        <w:t xml:space="preserve"> </w:t>
+      </w:r>
+      <w:r>
+        <w:t xml:space="preserve">evaluate its capacity to obtain help. The next development sample should span</w:t>
+      </w:r>
+      <w:r>
+        <w:t xml:space="preserve"> </w:t>
+      </w:r>
+      <w:r>
+        <w:t xml:space="preserve">observed difficulty and failure modes before the final test is frozen. It must</w:t>
+      </w:r>
+      <w:r>
+        <w:t xml:space="preserve"> </w:t>
+      </w:r>
+      <w:r>
+        <w:t xml:space="preserve">not select final tasks merely because they make conversation look useful. A</w:t>
+      </w:r>
+      <w:r>
+        <w:t xml:space="preserve"> </w:t>
+      </w:r>
+      <w:r>
+        <w:t xml:space="preserve">registered development-stratified sampling rule, followed by an untouched test</w:t>
+      </w:r>
+      <w:r>
+        <w:t xml:space="preserve"> </w:t>
+      </w:r>
+      <w:r>
+        <w:t xml:space="preserve">sample, can ensure both easy and difficult assignments without selecting on</w:t>
+      </w:r>
+      <w:r>
+        <w:t xml:space="preserve"> </w:t>
+      </w:r>
+      <w:r>
+        <w:t xml:space="preserve">final-treatment outcomes.</w:t>
+      </w:r>
+    </w:p>
+    <w:p>
+      <w:pPr>
+        <w:pStyle w:val="BodyText"/>
+      </w:pPr>
+      <w:r>
+        <w:t xml:space="preserve">The artifact-policy problem also matters. In a product, adding a good test to an</w:t>
+      </w:r>
+      <w:r>
+        <w:t xml:space="preserve"> </w:t>
+      </w:r>
+      <w:r>
+        <w:t xml:space="preserve">existing file is usually desirable. In a controlled repair benchmark, altering</w:t>
+      </w:r>
+      <w:r>
+        <w:t xml:space="preserve"> </w:t>
+      </w:r>
+      <w:r>
+        <w:t xml:space="preserve">the tests used for evaluation can invalidate success. The next protocol should</w:t>
+      </w:r>
+      <w:r>
+        <w:t xml:space="preserve"> </w:t>
+      </w:r>
+      <w:r>
+        <w:t xml:space="preserve">make that distinction explicit: immutable evaluator tests are outside the</w:t>
+      </w:r>
+      <w:r>
+        <w:t xml:space="preserve"> </w:t>
+      </w:r>
+      <w:r>
+        <w:t xml:space="preserve">worker, while permitted public-test additions are reviewed or applied under a</w:t>
+      </w:r>
+      <w:r>
+        <w:t xml:space="preserve"> </w:t>
+      </w:r>
+      <w:r>
+        <w:t xml:space="preserve">declared patch policy. The current frozen results remain intact. Reinterpreting</w:t>
+      </w:r>
+      <w:r>
+        <w:t xml:space="preserve"> </w:t>
+      </w:r>
+      <w:r>
+        <w:t xml:space="preserve">them as proof that conversational agents cannot follow constraints would be</w:t>
+      </w:r>
+      <w:r>
+        <w:t xml:space="preserve"> </w:t>
+      </w:r>
+      <w:r>
+        <w:t xml:space="preserve">unwarranted given the prompt ambiguity and tiny sample.</w:t>
+      </w:r>
+    </w:p>
+    <w:p>
+      <w:pPr>
+        <w:pStyle w:val="BodyText"/>
+      </w:pPr>
+      <w:r>
+        <w:t xml:space="preserve">Personalization and long-term learning remain optional, separable questions.</w:t>
+      </w:r>
+      <w:r>
+        <w:t xml:space="preserve"> </w:t>
+      </w:r>
+      <w:r>
+        <w:t xml:space="preserve">Editable memory has practical value as a user interface, but it does not</w:t>
+      </w:r>
+      <w:r>
+        <w:t xml:space="preserve"> </w:t>
+      </w:r>
+      <w:r>
+        <w:t xml:space="preserve">automatically improve task success. Existing developer-skill research motivates</w:t>
+      </w:r>
+      <w:r>
+        <w:t xml:space="preserve"> </w:t>
+      </w:r>
+      <w:r>
+        <w:t xml:space="preserve">generic and shuffled-user controls. RL can improve decisions without providing</w:t>
+      </w:r>
+      <w:r>
+        <w:t xml:space="preserve"> </w:t>
+      </w:r>
+      <w:r>
+        <w:t xml:space="preserve">an economical training path at small scale. Training cost, privacy boundaries,</w:t>
+      </w:r>
+      <w:r>
+        <w:t xml:space="preserve"> </w:t>
+      </w:r>
+      <w:r>
+        <w:t xml:space="preserve">feedback reliability and retained local capability must be measured. The</w:t>
+      </w:r>
+      <w:r>
+        <w:t xml:space="preserve"> </w:t>
+      </w:r>
+      <w:r>
+        <w:t xml:space="preserve">current code uses no model-weight update, and the live Codex experiment has no</w:t>
+      </w:r>
+      <w:r>
+        <w:t xml:space="preserve"> </w:t>
+      </w:r>
+      <w:r>
+        <w:t xml:space="preserve">access to the hosted models’ weights.</w:t>
+      </w:r>
+    </w:p>
+    <w:p>
+      <w:pPr>
+        <w:pStyle w:val="BodyText"/>
+      </w:pPr>
+      <w:r>
+        <w:t xml:space="preserve">More agents can supply complementary expertise, but also introduce duplicate</w:t>
+      </w:r>
+      <w:r>
+        <w:t xml:space="preserve"> </w:t>
+      </w:r>
+      <w:r>
+        <w:t xml:space="preserve">work and harder credit assignment. The minimal dyadic design should establish</w:t>
+      </w:r>
+      <w:r>
+        <w:t xml:space="preserve"> </w:t>
+      </w:r>
+      <w:r>
+        <w:t xml:space="preserve">when conversation helps before a many-to-many experiment claims emergent roles</w:t>
+      </w:r>
+      <w:r>
+        <w:t xml:space="preserve"> </w:t>
+      </w:r>
+      <w:r>
+        <w:t xml:space="preserve">or self-improvement. Existing graph and multi-agent learning frameworks should</w:t>
+      </w:r>
+      <w:r>
+        <w:t xml:space="preserve"> </w:t>
+      </w:r>
+      <w:r>
+        <w:t xml:space="preserve">be reused for that extension. The long-term ambition remains affordable,</w:t>
+      </w:r>
+      <w:r>
+        <w:t xml:space="preserve"> </w:t>
+      </w:r>
+      <w:r>
+        <w:t xml:space="preserve">user-controlled AI; that social objective is not demonstrated by a four-task</w:t>
+      </w:r>
+      <w:r>
+        <w:t xml:space="preserve"> </w:t>
+      </w:r>
+      <w:r>
+        <w:t xml:space="preserve">hosted-model pilot.</w:t>
+      </w:r>
+    </w:p>
+    <w:bookmarkEnd w:id="62"/>
+    <w:bookmarkStart w:id="64" w:name="reproducibility-and-next-execution"/>
+    <w:p>
+      <w:pPr>
+        <w:pStyle w:val="Heading1"/>
+      </w:pPr>
+      <w:r>
+        <w:rPr>
+          <w:rStyle w:val="SectionNumber"/>
+        </w:rPr>
+        <w:t xml:space="preserve">9</w:t>
+      </w:r>
+      <w:r>
+        <w:tab/>
+      </w:r>
+      <w:r>
+        <w:t xml:space="preserve">Reproducibility and next execution</w:t>
+      </w:r>
+    </w:p>
+    <w:p>
+      <w:pPr>
+        <w:pStyle w:val="FirstParagraph"/>
+      </w:pPr>
+      <w:r>
+        <w:t xml:space="preserve">The repository contains the full protocol and adapted benchmark provenance,</w:t>
+      </w:r>
+      <w:r>
+        <w:t xml:space="preserve"> </w:t>
+      </w:r>
+      <w:r>
+        <w:t xml:space="preserve">separate task workspaces, immutable grader source, regression reports, submitted</w:t>
+      </w:r>
+      <w:r>
+        <w:t xml:space="preserve"> </w:t>
+      </w:r>
+      <w:r>
+        <w:t xml:space="preserve">patches, nullable-cost records, dialogue transcript and analysis code. It also</w:t>
+      </w:r>
+      <w:r>
+        <w:t xml:space="preserve"> </w:t>
+      </w:r>
+      <w:r>
+        <w:t xml:space="preserve">contains a tested restore command that verifies downloaded archive hashes and</w:t>
+      </w:r>
+      <w:r>
+        <w:t xml:space="preserve"> </w:t>
+      </w:r>
+      <w:r>
+        <w:t xml:space="preserve">replays all buggy/fixed controls before creating new worker copies. It refuses</w:t>
+      </w:r>
+      <w:r>
+        <w:t xml:space="preserve"> </w:t>
+      </w:r>
+      <w:r>
+        <w:t xml:space="preserve">to overwrite existing destinations. The original source and evaluator trees</w:t>
+      </w:r>
+      <w:r>
+        <w:t xml:space="preserve"> </w:t>
+      </w:r>
+      <w:r>
+        <w:t xml:space="preserve">are checked against their manifest before grading.</w:t>
+      </w:r>
+    </w:p>
+    <w:p>
+      <w:pPr>
+        <w:pStyle w:val="BodyText"/>
+      </w:pPr>
+      <w:r>
+        <w:t xml:space="preserve">From a prepared research environment, the recorded analysis can be reproduced</w:t>
+      </w:r>
+      <w:r>
+        <w:t xml:space="preserve"> </w:t>
+      </w:r>
+      <w:r>
+        <w:t xml:space="preserve">without any model calls:</w:t>
+      </w:r>
+    </w:p>
+    <w:p>
+      <w:pPr>
+        <w:pStyle w:val="SourceCode"/>
+      </w:pPr>
+      <w:r>
+        <w:rPr>
+          <w:rStyle w:val="ExtensionTok"/>
+        </w:rPr>
+        <w:t xml:space="preserve">python</w:t>
+      </w:r>
+      <w:r>
+        <w:rPr>
+          <w:rStyle w:val="NormalTok"/>
+        </w:rPr>
+        <w:t xml:space="preserve"> scripts/analyze_codex_pilot.py </w:t>
+      </w:r>
+      <w:r>
+        <w:rPr>
+          <w:rStyle w:val="AttributeTok"/>
+        </w:rPr>
+        <w:t xml:space="preserve">--output-dir</w:t>
+      </w:r>
+      <w:r>
+        <w:rPr>
+          <w:rStyle w:val="NormalTok"/>
+        </w:rPr>
+        <w:t xml:space="preserve"> results/my-pilot-analysis</w:t>
+      </w:r>
+      <w:r>
+        <w:br/>
+      </w:r>
+      <w:r>
+        <w:rPr>
+          <w:rStyle w:val="ExtensionTok"/>
+        </w:rPr>
+        <w:t xml:space="preserve">python</w:t>
+      </w:r>
+      <w:r>
+        <w:rPr>
+          <w:rStyle w:val="NormalTok"/>
+        </w:rPr>
+        <w:t xml:space="preserve"> </w:t>
+      </w:r>
+      <w:r>
+        <w:rPr>
+          <w:rStyle w:val="AttributeTok"/>
+        </w:rPr>
+        <w:t xml:space="preserve">-m</w:t>
+      </w:r>
+      <w:r>
+        <w:rPr>
+          <w:rStyle w:val="NormalTok"/>
+        </w:rPr>
+        <w:t xml:space="preserve"> pytest </w:t>
+      </w:r>
+      <w:r>
+        <w:rPr>
+          <w:rStyle w:val="AttributeTok"/>
+        </w:rPr>
+        <w:t xml:space="preserve">-q</w:t>
+      </w:r>
+    </w:p>
+    <w:p>
+      <w:pPr>
+        <w:pStyle w:val="FirstParagraph"/>
+      </w:pPr>
+      <w:r>
+        <w:t xml:space="preserve">On a fresh compatible workspace, restore the historical benchmark fixtures:</w:t>
+      </w:r>
+    </w:p>
+    <w:p>
+      <w:pPr>
+        <w:pStyle w:val="SourceCode"/>
+      </w:pPr>
+      <w:r>
+        <w:rPr>
+          <w:rStyle w:val="ExtensionTok"/>
+        </w:rPr>
+        <w:t xml:space="preserve">python</w:t>
+      </w:r>
+      <w:r>
+        <w:rPr>
+          <w:rStyle w:val="NormalTok"/>
+        </w:rPr>
+        <w:t xml:space="preserve"> scripts/restore_codex_pilot.py </w:t>
+      </w:r>
+      <w:r>
+        <w:rPr>
+          <w:rStyle w:val="AttributeTok"/>
+        </w:rPr>
+        <w:t xml:space="preserve">--install-env</w:t>
+      </w:r>
+      <w:r>
+        <w:br/>
+      </w:r>
+      <w:r>
+        <w:rPr>
+          <w:rStyle w:val="ExtensionTok"/>
+        </w:rPr>
+        <w:t xml:space="preserve">python</w:t>
+      </w:r>
+      <w:r>
+        <w:rPr>
+          <w:rStyle w:val="NormalTok"/>
+        </w:rPr>
+        <w:t xml:space="preserve"> scripts/restore_codex_pilot.py </w:t>
+      </w:r>
+      <w:r>
+        <w:rPr>
+          <w:rStyle w:val="AttributeTok"/>
+        </w:rPr>
+        <w:t xml:space="preserve">--verify-only</w:t>
+      </w:r>
+    </w:p>
+    <w:p>
+      <w:pPr>
+        <w:pStyle w:val="FirstParagraph"/>
+      </w:pPr>
+      <w:r>
+        <w:t xml:space="preserve">The analysis command requires the research dependencies in</w:t>
+      </w:r>
+      <w:r>
+        <w:t xml:space="preserve"> </w:t>
+      </w:r>
+      <w:r>
+        <w:rPr>
+          <w:rStyle w:val="VerbatimChar"/>
+        </w:rPr>
+        <w:t xml:space="preserve">requirements-research.lock</w:t>
+      </w:r>
+      <w:r>
+        <w:t xml:space="preserve">. Restore uses its separately pinned CPython 3.8.20</w:t>
+      </w:r>
+      <w:r>
+        <w:t xml:space="preserve"> </w:t>
+      </w:r>
+      <w:r>
+        <w:t xml:space="preserve">environment and legacy test dependencies, and downloads the exact registered</w:t>
+      </w:r>
+      <w:r>
+        <w:t xml:space="preserve"> </w:t>
+      </w:r>
+      <w:r>
+        <w:t xml:space="preserve">public archives. The study is deliberately an adapted BugsInPy subset; the</w:t>
+      </w:r>
+      <w:r>
+        <w:t xml:space="preserve"> </w:t>
+      </w:r>
+      <w:r>
+        <w:t xml:space="preserve">restore process does not claim to recreate every original benchmark environment.</w:t>
+      </w:r>
+      <w:r>
+        <w:t xml:space="preserve"> </w:t>
+      </w:r>
+      <w:r>
+        <w:t xml:space="preserve">Do not execute new models in the recorded solved worker copies.</w:t>
+      </w:r>
+    </w:p>
+    <w:p>
+      <w:pPr>
+        <w:pStyle w:val="BodyText"/>
+      </w:pPr>
+      <w:r>
+        <w:t xml:space="preserve">For a normal machine with a writable, authenticated Codex installation, the</w:t>
+      </w:r>
+      <w:r>
+        <w:t xml:space="preserve"> </w:t>
+      </w:r>
+      <w:r>
+        <w:t xml:space="preserve">reusable adapter accepts a task manifest and a new output directory:</w:t>
+      </w:r>
+    </w:p>
+    <w:p>
+      <w:pPr>
+        <w:pStyle w:val="SourceCode"/>
+      </w:pPr>
+      <w:r>
+        <w:rPr>
+          <w:rStyle w:val="ExtensionTok"/>
+        </w:rPr>
+        <w:t xml:space="preserve">python</w:t>
+      </w:r>
+      <w:r>
+        <w:rPr>
+          <w:rStyle w:val="NormalTok"/>
+        </w:rPr>
+        <w:t xml:space="preserve"> </w:t>
+      </w:r>
+      <w:r>
+        <w:rPr>
+          <w:rStyle w:val="AttributeTok"/>
+        </w:rPr>
+        <w:t xml:space="preserve">-m</w:t>
+      </w:r>
+      <w:r>
+        <w:rPr>
+          <w:rStyle w:val="NormalTok"/>
+        </w:rPr>
+        <w:t xml:space="preserve"> ttgl.personal </w:t>
+      </w:r>
+      <w:r>
+        <w:rPr>
+          <w:rStyle w:val="AttributeTok"/>
+        </w:rPr>
+        <w:t xml:space="preserve">--task</w:t>
+      </w:r>
+      <w:r>
+        <w:rPr>
+          <w:rStyle w:val="NormalTok"/>
+        </w:rPr>
+        <w:t xml:space="preserve"> task.json </w:t>
+      </w:r>
+      <w:r>
+        <w:rPr>
+          <w:rStyle w:val="AttributeTok"/>
+        </w:rPr>
+        <w:t xml:space="preserve">--condition</w:t>
+      </w:r>
+      <w:r>
+        <w:rPr>
+          <w:rStyle w:val="NormalTok"/>
+        </w:rPr>
+        <w:t xml:space="preserve"> personal </w:t>
+      </w:r>
+      <w:r>
+        <w:rPr>
+          <w:rStyle w:val="DataTypeTok"/>
+        </w:rPr>
+        <w:t xml:space="preserve">\</w:t>
+      </w:r>
+      <w:r>
+        <w:br/>
+      </w:r>
+      <w:r>
+        <w:rPr>
+          <w:rStyle w:val="NormalTok"/>
+        </w:rPr>
+        <w:t xml:space="preserve">  </w:t>
+      </w:r>
+      <w:r>
+        <w:rPr>
+          <w:rStyle w:val="AttributeTok"/>
+        </w:rPr>
+        <w:t xml:space="preserve">--small-model</w:t>
+      </w:r>
+      <w:r>
+        <w:rPr>
+          <w:rStyle w:val="NormalTok"/>
+        </w:rPr>
+        <w:t xml:space="preserve"> gpt-6-luna </w:t>
+      </w:r>
+      <w:r>
+        <w:rPr>
+          <w:rStyle w:val="AttributeTok"/>
+        </w:rPr>
+        <w:t xml:space="preserve">--large-model</w:t>
+      </w:r>
+      <w:r>
+        <w:rPr>
+          <w:rStyle w:val="NormalTok"/>
+        </w:rPr>
+        <w:t xml:space="preserve"> gpt-6.1-sol </w:t>
+      </w:r>
+      <w:r>
+        <w:rPr>
+          <w:rStyle w:val="DataTypeTok"/>
+        </w:rPr>
+        <w:t xml:space="preserve">\</w:t>
+      </w:r>
+      <w:r>
+        <w:br/>
+      </w:r>
+      <w:r>
+        <w:rPr>
+          <w:rStyle w:val="NormalTok"/>
+        </w:rPr>
+        <w:t xml:space="preserve">  </w:t>
+      </w:r>
+      <w:r>
+        <w:rPr>
+          <w:rStyle w:val="AttributeTok"/>
+        </w:rPr>
+        <w:t xml:space="preserve">--max-expert-calls</w:t>
+      </w:r>
+      <w:r>
+        <w:rPr>
+          <w:rStyle w:val="NormalTok"/>
+        </w:rPr>
+        <w:t xml:space="preserve"> 2 </w:t>
+      </w:r>
+      <w:r>
+        <w:rPr>
+          <w:rStyle w:val="AttributeTok"/>
+        </w:rPr>
+        <w:t xml:space="preserve">--timeout-seconds</w:t>
+      </w:r>
+      <w:r>
+        <w:rPr>
+          <w:rStyle w:val="NormalTok"/>
+        </w:rPr>
+        <w:t xml:space="preserve"> 240 </w:t>
+      </w:r>
+      <w:r>
+        <w:rPr>
+          <w:rStyle w:val="DataTypeTok"/>
+        </w:rPr>
+        <w:t xml:space="preserve">\</w:t>
+      </w:r>
+      <w:r>
+        <w:br/>
+      </w:r>
+      <w:r>
+        <w:rPr>
+          <w:rStyle w:val="NormalTok"/>
+        </w:rPr>
+        <w:t xml:space="preserve">  </w:t>
+      </w:r>
+      <w:r>
+        <w:rPr>
+          <w:rStyle w:val="AttributeTok"/>
+        </w:rPr>
+        <w:t xml:space="preserve">--output-dir</w:t>
+      </w:r>
+      <w:r>
+        <w:rPr>
+          <w:rStyle w:val="NormalTok"/>
+        </w:rPr>
+        <w:t xml:space="preserve"> artifacts/new-conversation</w:t>
+      </w:r>
+    </w:p>
+    <w:p>
+      <w:pPr>
+        <w:pStyle w:val="FirstParagraph"/>
+      </w:pPr>
+      <w:r>
+        <w:t xml:space="preserve">The runbook documents the exact supported arguments, structured responses,</w:t>
+      </w:r>
+      <w:r>
+        <w:t xml:space="preserve"> </w:t>
+      </w:r>
+      <w:r>
+        <w:t xml:space="preserve">resumed threads, failure disposition and grading boundary. Completion means</w:t>
+      </w:r>
+      <w:r>
+        <w:t xml:space="preserve"> </w:t>
+      </w:r>
+      <w:r>
+        <w:t xml:space="preserve">the controller finished; it does not automatically mean the issue was resolved.</w:t>
+      </w:r>
+      <w:r>
+        <w:t xml:space="preserve"> </w:t>
+      </w:r>
+      <w:r>
+        <w:t xml:space="preserve">A unit-tested fake backend verifies the control flow without pretending to be</w:t>
+      </w:r>
+      <w:r>
+        <w:t xml:space="preserve"> </w:t>
+      </w:r>
+      <w:r>
+        <w:t xml:space="preserve">an LLM. The installed standalone CLI’s read-only-state failure in the present</w:t>
+      </w:r>
+      <w:r>
+        <w:t xml:space="preserve"> </w:t>
+      </w:r>
+      <w:r>
+        <w:t xml:space="preserve">managed session remains a known runtime limitation. The actual live trials used</w:t>
+      </w:r>
+      <w:r>
+        <w:t xml:space="preserve"> </w:t>
+      </w:r>
+      <w:r>
+        <w:t xml:space="preserve">the collaboration tool instead and do not establish CLI service readiness.</w:t>
+      </w:r>
+    </w:p>
+    <w:p>
+      <w:pPr>
+        <w:pStyle w:val="BodyText"/>
+      </w:pPr>
+      <w:r>
+        <w:t xml:space="preserve">The next performance experiment requires a larger frozen task sample, strong</w:t>
+      </w:r>
+      <w:r>
+        <w:t xml:space="preserve"> </w:t>
+      </w:r>
+      <w:r>
+        <w:t xml:space="preserve">worker/evaluator isolation, unambiguous artifact rules, a native one-way</w:t>
+      </w:r>
+      <w:r>
+        <w:t xml:space="preserve"> </w:t>
+      </w:r>
+      <w:r>
+        <w:t xml:space="preserve">assistance comparator and observable billing. It can use existing hosted Codex</w:t>
+      </w:r>
+      <w:r>
+        <w:t xml:space="preserve"> </w:t>
+      </w:r>
+      <w:r>
+        <w:t xml:space="preserve">agents if their usage can be recorded, or compatible open models through an</w:t>
+      </w:r>
+      <w:r>
+        <w:t xml:space="preserve"> </w:t>
+      </w:r>
+      <w:r>
+        <w:t xml:space="preserve">existing serving stack. A faithful reproduction of prior large-scale training</w:t>
+      </w:r>
+      <w:r>
+        <w:t xml:space="preserve"> </w:t>
+      </w:r>
+      <w:r>
+        <w:t xml:space="preserve">requires additional resources; it is not silently charged to the existing</w:t>
+      </w:r>
+      <w:r>
+        <w:t xml:space="preserve"> </w:t>
+      </w:r>
+      <w:r>
+        <w:t xml:space="preserve">US$100 Runpod allocation. No new credential is needed to reproduce the recorded</w:t>
+      </w:r>
+      <w:r>
+        <w:t xml:space="preserve"> </w:t>
+      </w:r>
+      <w:r>
+        <w:t xml:space="preserve">analysis. Credentials and connectivity are still required for future paid GPU</w:t>
+      </w:r>
+      <w:r>
+        <w:t xml:space="preserve"> </w:t>
+      </w:r>
+      <w:r>
+        <w:t xml:space="preserve">or provider runs.</w:t>
+      </w:r>
+    </w:p>
+    <w:p>
+      <w:pPr>
+        <w:pStyle w:val="BodyText"/>
+      </w:pPr>
+      <w:r>
+        <w:t xml:space="preserve">The new</w:t>
+      </w:r>
+      <w:r>
+        <w:t xml:space="preserve"> </w:t>
+      </w:r>
+      <w:r>
+        <w:rPr>
+          <w:rStyle w:val="VerbatimChar"/>
+        </w:rPr>
+        <w:t xml:space="preserve">scripts/run_swe_bench.py</w:t>
+      </w:r>
+      <w:r>
+        <w:t xml:space="preserve"> </w:t>
+      </w:r>
+      <w:r>
+        <w:t xml:space="preserve">bridge implements six frozen conditions,</w:t>
+      </w:r>
+      <w:r>
+        <w:t xml:space="preserve"> </w:t>
+      </w:r>
+      <w:r>
+        <w:t xml:space="preserve">mandatory native model-and-metering preflight, clean source checkouts, official</w:t>
+      </w:r>
+      <w:r>
+        <w:t xml:space="preserve"> </w:t>
+      </w:r>
+      <w:r>
+        <w:t xml:space="preserve">prediction export and grade import. One-way proposals and reset-expert</w:t>
+      </w:r>
+      <w:r>
+        <w:t xml:space="preserve"> </w:t>
+      </w:r>
+      <w:r>
+        <w:t xml:space="preserve">conversations are now software-tested arms.</w:t>
+      </w:r>
+      <w:r>
+        <w:t xml:space="preserve"> </w:t>
+      </w:r>
+      <w:r>
+        <w:rPr>
+          <w:rStyle w:val="VerbatimChar"/>
+        </w:rPr>
+        <w:t xml:space="preserve">scripts/collect_codex_usage.py</w:t>
+      </w:r>
+      <w:r>
+        <w:t xml:space="preserve"> </w:t>
+      </w:r>
+      <w:r>
+        <w:t xml:space="preserve">uses the official app-server’s per-thread estimate route without new inference.</w:t>
+      </w:r>
+      <w:r>
+        <w:t xml:space="preserve"> </w:t>
+      </w:r>
+      <w:r>
+        <w:t xml:space="preserve">The</w:t>
+      </w:r>
+      <w:r>
+        <w:t xml:space="preserve"> </w:t>
+      </w:r>
+      <w:hyperlink r:id="rId63">
+        <w:r>
+          <w:rPr>
+            <w:rStyle w:val="Hyperlink"/>
+          </w:rPr>
+          <w:t xml:space="preserve">handover</w:t>
+        </w:r>
+      </w:hyperlink>
+      <w:r>
+        <w:t xml:space="preserve"> </w:t>
+      </w:r>
+      <w:r>
+        <w:t xml:space="preserve">specifies the suitable writable host,</w:t>
+      </w:r>
+      <w:r>
+        <w:t xml:space="preserve"> </w:t>
+      </w:r>
+      <w:r>
+        <w:t xml:space="preserve">official evaluator controls, worker dependency/isolation prerequisites,</w:t>
+      </w:r>
+      <w:r>
+        <w:t xml:space="preserve"> </w:t>
+      </w:r>
+      <w:r>
+        <w:t xml:space="preserve">reproduction commands and pending work. Source-code readiness is distinct from</w:t>
+      </w:r>
+      <w:r>
+        <w:t xml:space="preserve"> </w:t>
+      </w:r>
+      <w:r>
+        <w:t xml:space="preserve">successful live metering or a completed causal comparison.</w:t>
+      </w:r>
+    </w:p>
+    <w:p>
+      <w:pPr>
+        <w:pStyle w:val="BodyText"/>
+      </w:pPr>
+      <w:r>
+        <w:t xml:space="preserve">Fastest Jira and Confluence synchronization remain unavailable in the current</w:t>
+      </w:r>
+      <w:r>
+        <w:t xml:space="preserve"> </w:t>
+      </w:r>
+      <w:r>
+        <w:t xml:space="preserve">tool set. Local task records and an import CSV preserve progress; they are not</w:t>
+      </w:r>
+      <w:r>
+        <w:t xml:space="preserve"> </w:t>
+      </w:r>
+      <w:r>
+        <w:t xml:space="preserve">remote issue keys or evidence of publication. The intended Confluence destination</w:t>
+      </w:r>
+      <w:r>
+        <w:t xml:space="preserve"> </w:t>
+      </w:r>
+      <w:r>
+        <w:t xml:space="preserve">remains the FASTEST space at fastestswarm.atlassian.net.</w:t>
+      </w:r>
+    </w:p>
+    <w:bookmarkEnd w:id="64"/>
+    <w:bookmarkStart w:id="65" w:name="conclusion"/>
+    <w:p>
+      <w:pPr>
+        <w:pStyle w:val="Heading1"/>
+      </w:pPr>
+      <w:r>
+        <w:rPr>
+          <w:rStyle w:val="SectionNumber"/>
+        </w:rPr>
+        <w:t xml:space="preserve">10</w:t>
+      </w:r>
+      <w:r>
+        <w:tab/>
+      </w:r>
+      <w:r>
+        <w:t xml:space="preserve">Conclusion</w:t>
+      </w:r>
+    </w:p>
+    <w:p>
+      <w:pPr>
+        <w:pStyle w:val="FirstParagraph"/>
+      </w:pPr>
+      <w:r>
+        <w:t xml:space="preserve">Small-model-led collaboration is established prior art, including learned</w:t>
+      </w:r>
+      <w:r>
+        <w:t xml:space="preserve"> </w:t>
+      </w:r>
+      <w:r>
+        <w:t xml:space="preserve">delegation for software engineering. The defensible hypothesis is whether</w:t>
+      </w:r>
+      <w:r>
+        <w:t xml:space="preserve"> </w:t>
+      </w:r>
+      <w:r>
+        <w:t xml:space="preserve">continuing, bounded conversation achieves materially lower</w:t>
+      </w:r>
+      <w:r>
+        <w:t xml:space="preserve"> </w:t>
+      </w:r>
+      <w:r>
+        <w:rPr>
+          <w:b/>
+          <w:bCs/>
+        </w:rPr>
         <w:t xml:space="preserve">total</w:t>
       </w:r>
       <w:r>
@@ -8073,47 +10421,59 @@
         <w:pStyle w:val="BodyText"/>
       </w:pPr>
       <w:r>
-        <w:t xml:space="preserve">The present work implements and validates the orchestration and measurement</w:t>
-      </w:r>
-      <w:r>
-        <w:t xml:space="preserve"> </w:t>
-      </w:r>
-      <w:r>
-        <w:t xml:space="preserve">path, executes a four-condition historical-bug pilot, and demonstrates one live</w:t>
-      </w:r>
-      <w:r>
-        <w:t xml:space="preserve"> </w:t>
-      </w:r>
-      <w:r>
-        <w:t xml:space="preserve">two-round clarification-and-integration exchange. It does not establish cost</w:t>
-      </w:r>
-      <w:r>
-        <w:t xml:space="preserve"> </w:t>
-      </w:r>
-      <w:r>
-        <w:t xml:space="preserve">savings or performance noninferiority. The complete records expose where the</w:t>
-      </w:r>
-      <w:r>
-        <w:t xml:space="preserve"> </w:t>
-      </w:r>
-      <w:r>
-        <w:t xml:space="preserve">pilot is informative and where its task scale, absent billing and grading</w:t>
-      </w:r>
-      <w:r>
-        <w:t xml:space="preserve"> </w:t>
-      </w:r>
-      <w:r>
-        <w:t xml:space="preserve">policy prevent a stronger conclusion. The registered next comparisons turn the</w:t>
-      </w:r>
-      <w:r>
-        <w:t xml:space="preserve"> </w:t>
-      </w:r>
-      <w:r>
-        <w:t xml:space="preserve">product intuition into a falsifiable software-engineering experiment.</w:t>
-      </w:r>
-    </w:p>
-    <w:bookmarkEnd w:id="55"/>
-    <w:bookmarkStart w:id="101" w:name="references"/>
+        <w:t xml:space="preserve">The present work implements and tests the orchestration and measurement code,</w:t>
+      </w:r>
+      <w:r>
+        <w:t xml:space="preserve"> </w:t>
+      </w:r>
+      <w:r>
+        <w:t xml:space="preserve">executes a four-condition historical-bug pilot, demonstrates one live two-round</w:t>
+      </w:r>
+      <w:r>
+        <w:t xml:space="preserve"> </w:t>
+      </w:r>
+      <w:r>
+        <w:t xml:space="preserve">clarification exchange, and analyzes all 500 SWE-bench Verified tasks across ten</w:t>
+      </w:r>
+      <w:r>
+        <w:t xml:space="preserve"> </w:t>
+      </w:r>
+      <w:r>
+        <w:t xml:space="preserve">published model runs. The primary replay router reduces estimated inference</w:t>
+      </w:r>
+      <w:r>
+        <w:t xml:space="preserve"> </w:t>
+      </w:r>
+      <w:r>
+        <w:t xml:space="preserve">cost by 46.1% but loses 8.6 quality points; it fails the joint target. Portfolio</w:t>
+      </w:r>
+      <w:r>
+        <w:t xml:space="preserve"> </w:t>
+      </w:r>
+      <w:r>
+        <w:t xml:space="preserve">results also show why an inexpensive strong standalone model is essential as a</w:t>
+      </w:r>
+      <w:r>
+        <w:t xml:space="preserve"> </w:t>
+      </w:r>
+      <w:r>
+        <w:t xml:space="preserve">control. These are useful empirical findings without establishing live</w:t>
+      </w:r>
+      <w:r>
+        <w:t xml:space="preserve"> </w:t>
+      </w:r>
+      <w:r>
+        <w:t xml:space="preserve">conversational savings or performance noninferiority. The next comparisons test</w:t>
+      </w:r>
+      <w:r>
+        <w:t xml:space="preserve"> </w:t>
+      </w:r>
+      <w:r>
+        <w:t xml:space="preserve">that remaining causal claim with observable subscription or inference usage.</w:t>
+      </w:r>
+    </w:p>
+    <w:bookmarkEnd w:id="65"/>
+    <w:bookmarkStart w:id="113" w:name="references"/>
     <w:p>
       <w:pPr>
         <w:pStyle w:val="Heading1"/>
@@ -8122,8 +10482,8 @@
         <w:t xml:space="preserve">References</w:t>
       </w:r>
     </w:p>
-    <w:bookmarkStart w:id="100" w:name="refs"/>
-    <w:bookmarkStart w:id="57" w:name="ref-belcak2025smallagents"/>
+    <w:bookmarkStart w:id="112" w:name="refs"/>
+    <w:bookmarkStart w:id="67" w:name="ref-belcak2025smallagents"/>
     <w:p>
       <w:pPr>
         <w:pStyle w:val="Bibliography"/>
@@ -8143,7 +10503,7 @@
       <w:r>
         <w:t xml:space="preserve"> </w:t>
       </w:r>
-      <w:hyperlink r:id="rId56">
+      <w:hyperlink r:id="rId66">
         <w:r>
           <w:rPr>
             <w:rStyle w:val="Hyperlink"/>
@@ -8155,8 +10515,8 @@
         <w:t xml:space="preserve">.</w:t>
       </w:r>
     </w:p>
-    <w:bookmarkEnd w:id="57"/>
-    <w:bookmarkStart w:id="59" w:name="ref-ttglbugsinpy2026"/>
+    <w:bookmarkEnd w:id="67"/>
+    <w:bookmarkStart w:id="69" w:name="ref-ttglbugsinpy2026"/>
     <w:p>
       <w:pPr>
         <w:pStyle w:val="Bibliography"/>
@@ -8176,7 +10536,7 @@
       <w:r>
         <w:t xml:space="preserve"> </w:t>
       </w:r>
-      <w:hyperlink r:id="rId58">
+      <w:hyperlink r:id="rId68">
         <w:r>
           <w:rPr>
             <w:rStyle w:val="Hyperlink"/>
@@ -8188,8 +10548,8 @@
         <w:t xml:space="preserve">.</w:t>
       </w:r>
     </w:p>
-    <w:bookmarkEnd w:id="59"/>
-    <w:bookmarkStart w:id="61" w:name="ref-cui2026unoorchestra"/>
+    <w:bookmarkEnd w:id="69"/>
+    <w:bookmarkStart w:id="71" w:name="ref-cui2026unoorchestra"/>
     <w:p>
       <w:pPr>
         <w:pStyle w:val="Bibliography"/>
@@ -8209,7 +10569,7 @@
       <w:r>
         <w:t xml:space="preserve"> </w:t>
       </w:r>
-      <w:hyperlink r:id="rId60">
+      <w:hyperlink r:id="rId70">
         <w:r>
           <w:rPr>
             <w:rStyle w:val="Hyperlink"/>
@@ -8221,8 +10581,8 @@
         <w:t xml:space="preserve">.</w:t>
       </w:r>
     </w:p>
-    <w:bookmarkEnd w:id="61"/>
-    <w:bookmarkStart w:id="63" w:name="ref-gao2026decisionbench"/>
+    <w:bookmarkEnd w:id="71"/>
+    <w:bookmarkStart w:id="73" w:name="ref-gao2026decisionbench"/>
     <w:p>
       <w:pPr>
         <w:pStyle w:val="Bibliography"/>
@@ -8242,7 +10602,7 @@
       <w:r>
         <w:t xml:space="preserve"> </w:t>
       </w:r>
-      <w:hyperlink r:id="rId62">
+      <w:hyperlink r:id="rId72">
         <w:r>
           <w:rPr>
             <w:rStyle w:val="Hyperlink"/>
@@ -8254,8 +10614,8 @@
         <w:t xml:space="preserve">.</w:t>
       </w:r>
     </w:p>
-    <w:bookmarkEnd w:id="63"/>
-    <w:bookmarkStart w:id="65" w:name="ref-he2026agentlightning"/>
+    <w:bookmarkEnd w:id="73"/>
+    <w:bookmarkStart w:id="75" w:name="ref-he2026agentlightning"/>
     <w:p>
       <w:pPr>
         <w:pStyle w:val="Bibliography"/>
@@ -8275,7 +10635,7 @@
       <w:r>
         <w:t xml:space="preserve"> </w:t>
       </w:r>
-      <w:hyperlink r:id="rId64">
+      <w:hyperlink r:id="rId74">
         <w:r>
           <w:rPr>
             <w:rStyle w:val="Hyperlink"/>
@@ -8287,8 +10647,8 @@
         <w:t xml:space="preserve">.</w:t>
       </w:r>
     </w:p>
-    <w:bookmarkEnd w:id="65"/>
-    <w:bookmarkStart w:id="67" w:name="ref-huang2026personalskills"/>
+    <w:bookmarkEnd w:id="75"/>
+    <w:bookmarkStart w:id="77" w:name="ref-huang2026personalskills"/>
     <w:p>
       <w:pPr>
         <w:pStyle w:val="Bibliography"/>
@@ -8308,7 +10668,7 @@
       <w:r>
         <w:t xml:space="preserve"> </w:t>
       </w:r>
-      <w:hyperlink r:id="rId66">
+      <w:hyperlink r:id="rId76">
         <w:r>
           <w:rPr>
             <w:rStyle w:val="Hyperlink"/>
@@ -8320,8 +10680,8 @@
         <w:t xml:space="preserve">.</w:t>
       </w:r>
     </w:p>
-    <w:bookmarkEnd w:id="67"/>
-    <w:bookmarkStart w:id="69" w:name="ref-jimenez2024swebench"/>
+    <w:bookmarkEnd w:id="77"/>
+    <w:bookmarkStart w:id="79" w:name="ref-jimenez2024swebench"/>
     <w:p>
       <w:pPr>
         <w:pStyle w:val="Bibliography"/>
@@ -8354,7 +10714,7 @@
       <w:r>
         <w:t xml:space="preserve"> </w:t>
       </w:r>
-      <w:hyperlink r:id="rId68">
+      <w:hyperlink r:id="rId78">
         <w:r>
           <w:rPr>
             <w:rStyle w:val="Hyperlink"/>
@@ -8366,8 +10726,8 @@
         <w:t xml:space="preserve">.</w:t>
       </w:r>
     </w:p>
-    <w:bookmarkEnd w:id="69"/>
-    <w:bookmarkStart w:id="71" w:name="ref-ttgllettacode2026"/>
+    <w:bookmarkEnd w:id="79"/>
+    <w:bookmarkStart w:id="81" w:name="ref-ttgllettacode2026"/>
     <w:p>
       <w:pPr>
         <w:pStyle w:val="Bibliography"/>
@@ -8387,7 +10747,7 @@
       <w:r>
         <w:t xml:space="preserve"> </w:t>
       </w:r>
-      <w:hyperlink r:id="rId70">
+      <w:hyperlink r:id="rId80">
         <w:r>
           <w:rPr>
             <w:rStyle w:val="Hyperlink"/>
@@ -8399,8 +10759,8 @@
         <w:t xml:space="preserve">.</w:t>
       </w:r>
     </w:p>
-    <w:bookmarkEnd w:id="71"/>
-    <w:bookmarkStart w:id="73" w:name="ref-li2026mempabench"/>
+    <w:bookmarkEnd w:id="81"/>
+    <w:bookmarkStart w:id="83" w:name="ref-li2026mempabench"/>
     <w:p>
       <w:pPr>
         <w:pStyle w:val="Bibliography"/>
@@ -8420,7 +10780,7 @@
       <w:r>
         <w:t xml:space="preserve"> </w:t>
       </w:r>
-      <w:hyperlink r:id="rId72">
+      <w:hyperlink r:id="rId82">
         <w:r>
           <w:rPr>
             <w:rStyle w:val="Hyperlink"/>
@@ -8432,8 +10792,8 @@
         <w:t xml:space="preserve">.</w:t>
       </w:r>
     </w:p>
-    <w:bookmarkEnd w:id="73"/>
-    <w:bookmarkStart w:id="75" w:name="ref-liu2026nanomuse"/>
+    <w:bookmarkEnd w:id="83"/>
+    <w:bookmarkStart w:id="85" w:name="ref-liu2026nanomuse"/>
     <w:p>
       <w:pPr>
         <w:pStyle w:val="Bibliography"/>
@@ -8453,7 +10813,7 @@
       <w:r>
         <w:t xml:space="preserve"> </w:t>
       </w:r>
-      <w:hyperlink r:id="rId74">
+      <w:hyperlink r:id="rId84">
         <w:r>
           <w:rPr>
             <w:rStyle w:val="Hyperlink"/>
@@ -8465,8 +10825,8 @@
         <w:t xml:space="preserve">.</w:t>
       </w:r>
     </w:p>
-    <w:bookmarkEnd w:id="75"/>
-    <w:bookmarkStart w:id="77" w:name="ref-ong2024routellm"/>
+    <w:bookmarkEnd w:id="85"/>
+    <w:bookmarkStart w:id="87" w:name="ref-ong2024routellm"/>
     <w:p>
       <w:pPr>
         <w:pStyle w:val="Bibliography"/>
@@ -8499,7 +10859,7 @@
       <w:r>
         <w:t xml:space="preserve"> </w:t>
       </w:r>
-      <w:hyperlink r:id="rId76">
+      <w:hyperlink r:id="rId86">
         <w:r>
           <w:rPr>
             <w:rStyle w:val="Hyperlink"/>
@@ -8511,8 +10871,8 @@
         <w:t xml:space="preserve">.</w:t>
       </w:r>
     </w:p>
-    <w:bookmarkEnd w:id="77"/>
-    <w:bookmarkStart w:id="79" w:name="ref-packer2024memgpt"/>
+    <w:bookmarkEnd w:id="87"/>
+    <w:bookmarkStart w:id="89" w:name="ref-packer2024memgpt"/>
     <w:p>
       <w:pPr>
         <w:pStyle w:val="Bibliography"/>
@@ -8545,7 +10905,7 @@
       <w:r>
         <w:t xml:space="preserve"> </w:t>
       </w:r>
-      <w:hyperlink r:id="rId78">
+      <w:hyperlink r:id="rId88">
         <w:r>
           <w:rPr>
             <w:rStyle w:val="Hyperlink"/>
@@ -8557,8 +10917,8 @@
         <w:t xml:space="preserve">.</w:t>
       </w:r>
     </w:p>
-    <w:bookmarkEnd w:id="79"/>
-    <w:bookmarkStart w:id="81" w:name="ref-shi2026edgewise"/>
+    <w:bookmarkEnd w:id="89"/>
+    <w:bookmarkStart w:id="91" w:name="ref-shi2026edgewise"/>
     <w:p>
       <w:pPr>
         <w:pStyle w:val="Bibliography"/>
@@ -8578,7 +10938,7 @@
       <w:r>
         <w:t xml:space="preserve"> </w:t>
       </w:r>
-      <w:hyperlink r:id="rId80">
+      <w:hyperlink r:id="rId90">
         <w:r>
           <w:rPr>
             <w:rStyle w:val="Hyperlink"/>
@@ -8590,8 +10950,8 @@
         <w:t xml:space="preserve">.</w:t>
       </w:r>
     </w:p>
-    <w:bookmarkEnd w:id="81"/>
-    <w:bookmarkStart w:id="83" w:name="ref-shinn2023reflexion"/>
+    <w:bookmarkEnd w:id="91"/>
+    <w:bookmarkStart w:id="93" w:name="ref-shinn2023reflexion"/>
     <w:p>
       <w:pPr>
         <w:pStyle w:val="Bibliography"/>
@@ -8611,7 +10971,7 @@
       <w:r>
         <w:t xml:space="preserve"> </w:t>
       </w:r>
-      <w:hyperlink r:id="rId82">
+      <w:hyperlink r:id="rId92">
         <w:r>
           <w:rPr>
             <w:rStyle w:val="Hyperlink"/>
@@ -8623,8 +10983,8 @@
         <w:t xml:space="preserve">.</w:t>
       </w:r>
     </w:p>
-    <w:bookmarkEnd w:id="83"/>
-    <w:bookmarkStart w:id="85" w:name="ref-ttglhistoricalleaderboard2026"/>
+    <w:bookmarkEnd w:id="93"/>
+    <w:bookmarkStart w:id="95" w:name="ref-ttglhistoricalleaderboard2026"/>
     <w:p>
       <w:pPr>
         <w:pStyle w:val="Bibliography"/>
@@ -8644,7 +11004,7 @@
       <w:r>
         <w:t xml:space="preserve"> </w:t>
       </w:r>
-      <w:hyperlink r:id="rId84">
+      <w:hyperlink r:id="rId94">
         <w:r>
           <w:rPr>
             <w:rStyle w:val="Hyperlink"/>
@@ -8656,13 +11016,46 @@
         <w:t xml:space="preserve">.</w:t>
       </w:r>
     </w:p>
-    <w:bookmarkEnd w:id="85"/>
-    <w:bookmarkStart w:id="87" w:name="ref-swebenchverified2024"/>
+    <w:bookmarkEnd w:id="95"/>
+    <w:bookmarkStart w:id="97" w:name="ref-ttglsweexperiments2026"/>
     <w:p>
       <w:pPr>
         <w:pStyle w:val="Bibliography"/>
       </w:pPr>
       <w:r>
+        <w:t xml:space="preserve">SWE-bench maintainers and submission authors. 2026.</w:t>
+      </w:r>
+      <w:r>
+        <w:t xml:space="preserve"> </w:t>
+      </w:r>
+      <w:r>
+        <w:t xml:space="preserve">‘SWE-Bench Verified Experiments: Mini-SWE-Agent 2.0.0 Submissions’</w:t>
+      </w:r>
+      <w:r>
+        <w:t xml:space="preserve">. GitHub, pinned revision 40f164d5b8f1d249bf95a6df8b74b577fd8e519d.</w:t>
+      </w:r>
+      <w:r>
+        <w:t xml:space="preserve"> </w:t>
+      </w:r>
+      <w:hyperlink r:id="rId96">
+        <w:r>
+          <w:rPr>
+            <w:rStyle w:val="Hyperlink"/>
+          </w:rPr>
+          <w:t xml:space="preserve">https://github.com/SWE-bench/experiments/tree/40f164d5b8f1d249bf95a6df8b74b577fd8e519d/evaluation/verified</w:t>
+        </w:r>
+      </w:hyperlink>
+      <w:r>
+        <w:t xml:space="preserve">.</w:t>
+      </w:r>
+    </w:p>
+    <w:bookmarkEnd w:id="97"/>
+    <w:bookmarkStart w:id="99" w:name="ref-swebenchverified2024"/>
+    <w:p>
+      <w:pPr>
+        <w:pStyle w:val="Bibliography"/>
+      </w:pPr>
+      <w:r>
         <w:t xml:space="preserve">SWE-bench Team. 2024.</w:t>
       </w:r>
       <w:r>
@@ -8677,7 +11070,7 @@
       <w:r>
         <w:t xml:space="preserve"> </w:t>
       </w:r>
-      <w:hyperlink r:id="rId86">
+      <w:hyperlink r:id="rId98">
         <w:r>
           <w:rPr>
             <w:rStyle w:val="Hyperlink"/>
@@ -8689,8 +11082,8 @@
         <w:t xml:space="preserve">.</w:t>
       </w:r>
     </w:p>
-    <w:bookmarkEnd w:id="87"/>
-    <w:bookmarkStart w:id="89" w:name="ref-wan2025rema"/>
+    <w:bookmarkEnd w:id="99"/>
+    <w:bookmarkStart w:id="101" w:name="ref-wan2025rema"/>
     <w:p>
       <w:pPr>
         <w:pStyle w:val="Bibliography"/>
@@ -8710,7 +11103,7 @@
       <w:r>
         <w:t xml:space="preserve"> </w:t>
       </w:r>
-      <w:hyperlink r:id="rId88">
+      <w:hyperlink r:id="rId100">
         <w:r>
           <w:rPr>
             <w:rStyle w:val="Hyperlink"/>
@@ -8722,8 +11115,8 @@
         <w:t xml:space="preserve">.</w:t>
       </w:r>
     </w:p>
-    <w:bookmarkEnd w:id="89"/>
-    <w:bookmarkStart w:id="91" w:name="ref-xu2025amem"/>
+    <w:bookmarkEnd w:id="101"/>
+    <w:bookmarkStart w:id="103" w:name="ref-xu2025amem"/>
     <w:p>
       <w:pPr>
         <w:pStyle w:val="Bibliography"/>
@@ -8743,7 +11136,7 @@
       <w:r>
         <w:t xml:space="preserve"> </w:t>
       </w:r>
-      <w:hyperlink r:id="rId90">
+      <w:hyperlink r:id="rId102">
         <w:r>
           <w:rPr>
             <w:rStyle w:val="Hyperlink"/>
@@ -8755,8 +11148,8 @@
         <w:t xml:space="preserve">.</w:t>
       </w:r>
     </w:p>
-    <w:bookmarkEnd w:id="91"/>
-    <w:bookmarkStart w:id="93" w:name="ref-yue2025masrouter"/>
+    <w:bookmarkEnd w:id="103"/>
+    <w:bookmarkStart w:id="105" w:name="ref-yue2025masrouter"/>
     <w:p>
       <w:pPr>
         <w:pStyle w:val="Bibliography"/>
@@ -8776,7 +11169,7 @@
       <w:r>
         <w:t xml:space="preserve"> </w:t>
       </w:r>
-      <w:hyperlink r:id="rId92">
+      <w:hyperlink r:id="rId104">
         <w:r>
           <w:rPr>
             <w:rStyle w:val="Hyperlink"/>
@@ -8788,8 +11181,8 @@
         <w:t xml:space="preserve">.</w:t>
       </w:r>
     </w:p>
-    <w:bookmarkEnd w:id="93"/>
-    <w:bookmarkStart w:id="95" w:name="ref-zhang2025routerr1"/>
+    <w:bookmarkEnd w:id="105"/>
+    <w:bookmarkStart w:id="107" w:name="ref-zhang2025routerr1"/>
     <w:p>
       <w:pPr>
         <w:pStyle w:val="Bibliography"/>
@@ -8809,7 +11202,7 @@
       <w:r>
         <w:t xml:space="preserve"> </w:t>
       </w:r>
-      <w:hyperlink r:id="rId94">
+      <w:hyperlink r:id="rId106">
         <w:r>
           <w:rPr>
             <w:rStyle w:val="Hyperlink"/>
@@ -8821,8 +11214,8 @@
         <w:t xml:space="preserve">.</w:t>
       </w:r>
     </w:p>
-    <w:bookmarkEnd w:id="95"/>
-    <w:bookmarkStart w:id="97" w:name="ref-zhou2025memento"/>
+    <w:bookmarkEnd w:id="107"/>
+    <w:bookmarkStart w:id="109" w:name="ref-zhou2025memento"/>
     <w:p>
       <w:pPr>
         <w:pStyle w:val="Bibliography"/>
@@ -8842,7 +11235,7 @@
       <w:r>
         <w:t xml:space="preserve"> </w:t>
       </w:r>
-      <w:hyperlink r:id="rId96">
+      <w:hyperlink r:id="rId108">
         <w:r>
           <w:rPr>
             <w:rStyle w:val="Hyperlink"/>
@@ -8854,8 +11247,8 @@
         <w:t xml:space="preserve">.</w:t>
       </w:r>
     </w:p>
-    <w:bookmarkEnd w:id="97"/>
-    <w:bookmarkStart w:id="99" w:name="ref-zhuge2024gptswarm"/>
+    <w:bookmarkEnd w:id="109"/>
+    <w:bookmarkStart w:id="111" w:name="ref-zhuge2024gptswarm"/>
     <w:p>
       <w:pPr>
         <w:pStyle w:val="Bibliography"/>
@@ -8875,7 +11268,7 @@
       <w:r>
         <w:t xml:space="preserve"> </w:t>
       </w:r>
-      <w:hyperlink r:id="rId98">
+      <w:hyperlink r:id="rId110">
         <w:r>
           <w:rPr>
             <w:rStyle w:val="Hyperlink"/>
@@ -8887,9 +11280,9 @@
         <w:t xml:space="preserve">.</w:t>
       </w:r>
     </w:p>
-    <w:bookmarkEnd w:id="99"/>
-    <w:bookmarkEnd w:id="100"/>
-    <w:bookmarkEnd w:id="101"/>
+    <w:bookmarkEnd w:id="111"/>
+    <w:bookmarkEnd w:id="112"/>
+    <w:bookmarkEnd w:id="113"/>
     <w:sectPr/>
   </w:body>
 </w:document>

</xml_diff>